<commit_message>
fix: v4.1.9 - perbaikan penilaian essay manual (koreksi benar/salah + skor parsial)
- Tambah tombol Benar/Salah di UI koreksi essay (GradeRecap)
- Fix kalkulasi nilai: hanya soal yang diterima siswa yang dihitung (bukan semua soal test)
- Fix essay belum dikoreksi tidak lagi menggembungkan penyebut (denominator)
- scoring.ts: refactor agar setiap tipe soal kelola totalWeight sendiri

Co-Authored-By: Claude Sonnet 4.6 <noreply@anthropic.com>
</commit_message>
<xml_diff>
--- a/frontend/public/TEMPLATE_SOAL_CBT.docx
+++ b/frontend/public/TEMPLATE_SOAL_CBT.docx
@@ -2117,6 +2117,885 @@
       <w:tr>
         <w:tc>
           <w:tcPr>
+            <w:tcW w:w="400" w:type="dxa"/>
+            <w:shd w:val="clear" w:color="auto" w:fill="F1F5F9"/>
+            <w:vAlign w:val="top"/>
+            <w:tcMar>
+              <w:top w:w="80" w:type="dxa"/>
+              <w:bottom w:w="60" w:type="dxa"/>
+              <w:left w:w="60" w:type="dxa"/>
+              <w:right w:w="60" w:type="dxa"/>
+            </w:tcMar>
+          </w:tcPr>
+          <w:p>
+            <w:pPr>
+              <w:jc w:val="center"/>
+              <w:spacing w:before="0" w:after="0"/>
+            </w:pPr>
+            <w:r>
+              <w:rPr>
+                <w:rFonts w:ascii="Calibri" w:hAnsi="Calibri"/>
+                <w:b/>
+                <w:i w:val="0"/>
+                <w:color w:val="1E3A8A"/>
+                <w:sz w:val="18"/>
+              </w:rPr>
+              <w:t>3</w:t>
+            </w:r>
+          </w:p>
+        </w:tc>
+        <w:tc>
+          <w:tcPr>
+            <w:tcW w:w="3000" w:type="dxa"/>
+            <w:shd w:val="clear" w:color="auto" w:fill="EFF6FF"/>
+            <w:vAlign w:val="top"/>
+            <w:tcMar>
+              <w:top w:w="80" w:type="dxa"/>
+              <w:bottom w:w="60" w:type="dxa"/>
+              <w:left w:w="100" w:type="dxa"/>
+              <w:right w:w="80" w:type="dxa"/>
+            </w:tcMar>
+          </w:tcPr>
+          <w:p>
+            <w:pPr>
+              <w:spacing w:before="0" w:after="0"/>
+            </w:pPr>
+            <w:r>
+              <w:rPr>
+                <w:rFonts w:ascii="Calibri" w:hAnsi="Calibri"/>
+                <w:b w:val="0"/>
+                <w:i w:val="0"/>
+                <w:color w:val="374151"/>
+                <w:sz w:val="19"/>
+              </w:rPr>
+              <w:t>Dengarkan rekaman audio berikut!</w:t>
+              <w:br/>
+              <w:t>MEDIA: https://example.com/audio/soal3.mp3</w:t>
+              <w:br/>
+              <w:t>Alat musik apakah yang paling dominan terdengar dalam rekaman tersebut?</w:t>
+            </w:r>
+          </w:p>
+          <w:p>
+            <w:pPr>
+              <w:spacing w:before="60" w:after="0"/>
+              <w:jc w:val="left"/>
+            </w:pPr>
+            <w:r>
+              <w:drawing>
+                <wp:inline xmlns:a="http://schemas.openxmlformats.org/drawingml/2006/main" xmlns:pic="http://schemas.openxmlformats.org/drawingml/2006/picture">
+                  <wp:extent cx="1620000" cy="506250"/>
+                  <wp:docPr id="2" name="Picture 2"/>
+                  <wp:cNvGraphicFramePr>
+                    <a:graphicFrameLocks noChangeAspect="1"/>
+                  </wp:cNvGraphicFramePr>
+                  <a:graphic>
+                    <a:graphicData uri="http://schemas.openxmlformats.org/drawingml/2006/picture">
+                      <pic:pic>
+                        <pic:nvPicPr>
+                          <pic:cNvPr id="0" name="image.png"/>
+                          <pic:cNvPicPr/>
+                        </pic:nvPicPr>
+                        <pic:blipFill>
+                          <a:blip r:embed="rId10"/>
+                          <a:stretch>
+                            <a:fillRect/>
+                          </a:stretch>
+                        </pic:blipFill>
+                        <pic:spPr>
+                          <a:xfrm>
+                            <a:off x="0" y="0"/>
+                            <a:ext cx="1620000" cy="506250"/>
+                          </a:xfrm>
+                          <a:prstGeom prst="rect"/>
+                        </pic:spPr>
+                      </pic:pic>
+                    </a:graphicData>
+                  </a:graphic>
+                </wp:inline>
+              </w:drawing>
+            </w:r>
+          </w:p>
+        </w:tc>
+        <w:tc>
+          <w:tcPr>
+            <w:tcW w:w="900" w:type="dxa"/>
+            <w:shd w:val="clear" w:color="auto" w:fill="93C5FD"/>
+            <w:vAlign w:val="center"/>
+            <w:tcMar>
+              <w:top w:w="80" w:type="dxa"/>
+              <w:bottom w:w="80" w:type="dxa"/>
+              <w:left w:w="60" w:type="dxa"/>
+              <w:right w:w="60" w:type="dxa"/>
+            </w:tcMar>
+          </w:tcPr>
+          <w:p>
+            <w:pPr>
+              <w:jc w:val="center"/>
+              <w:spacing w:before="0" w:after="0"/>
+            </w:pPr>
+            <w:r>
+              <w:rPr>
+                <w:rFonts w:ascii="Calibri" w:hAnsi="Calibri"/>
+                <w:b/>
+                <w:i w:val="0"/>
+                <w:color w:val="1E3A8A"/>
+                <w:sz w:val="16"/>
+              </w:rPr>
+              <w:t>PG</w:t>
+            </w:r>
+          </w:p>
+        </w:tc>
+        <w:tc>
+          <w:tcPr>
+            <w:tcW w:w="600" w:type="dxa"/>
+            <w:shd w:val="clear" w:color="auto" w:fill="FFFFFF"/>
+            <w:vAlign w:val="top"/>
+            <w:tcMar>
+              <w:top w:w="60" w:type="dxa"/>
+              <w:bottom w:w="60" w:type="dxa"/>
+              <w:left w:w="100" w:type="dxa"/>
+              <w:right w:w="80" w:type="dxa"/>
+            </w:tcMar>
+          </w:tcPr>
+          <w:p>
+            <w:pPr>
+              <w:jc w:val="left"/>
+              <w:spacing w:before="0" w:after="0"/>
+            </w:pPr>
+          </w:p>
+        </w:tc>
+        <w:tc>
+          <w:tcPr>
+            <w:tcW w:w="4506" w:type="dxa"/>
+            <w:shd w:val="clear" w:color="auto" w:fill="FFFFFF"/>
+            <w:vAlign w:val="top"/>
+            <w:tcMar>
+              <w:top w:w="60" w:type="dxa"/>
+              <w:bottom w:w="60" w:type="dxa"/>
+              <w:left w:w="100" w:type="dxa"/>
+              <w:right w:w="80" w:type="dxa"/>
+            </w:tcMar>
+          </w:tcPr>
+          <w:p>
+            <w:pPr>
+              <w:jc w:val="left"/>
+              <w:spacing w:before="0" w:after="0"/>
+            </w:pPr>
+          </w:p>
+        </w:tc>
+        <w:tc>
+          <w:tcPr>
+            <w:tcW w:w="800" w:type="dxa"/>
+            <w:shd w:val="clear" w:color="auto" w:fill="FFFFFF"/>
+            <w:vAlign w:val="top"/>
+            <w:tcMar>
+              <w:top w:w="60" w:type="dxa"/>
+              <w:bottom w:w="60" w:type="dxa"/>
+              <w:left w:w="100" w:type="dxa"/>
+              <w:right w:w="80" w:type="dxa"/>
+            </w:tcMar>
+          </w:tcPr>
+          <w:p>
+            <w:pPr>
+              <w:jc w:val="left"/>
+              <w:spacing w:before="0" w:after="0"/>
+            </w:pPr>
+          </w:p>
+        </w:tc>
+      </w:tr>
+      <w:tr>
+        <w:tc>
+          <w:tcPr>
+            <w:tcW w:w="400" w:type="dxa"/>
+            <w:shd w:val="clear" w:color="auto" w:fill="F1F5F9"/>
+            <w:vAlign w:val="top"/>
+            <w:tcMar>
+              <w:top w:w="60" w:type="dxa"/>
+              <w:bottom w:w="60" w:type="dxa"/>
+              <w:left w:w="100" w:type="dxa"/>
+              <w:right w:w="80" w:type="dxa"/>
+            </w:tcMar>
+          </w:tcPr>
+          <w:p>
+            <w:pPr>
+              <w:jc w:val="left"/>
+              <w:spacing w:before="0" w:after="0"/>
+            </w:pPr>
+          </w:p>
+        </w:tc>
+        <w:tc>
+          <w:tcPr>
+            <w:tcW w:w="3000" w:type="dxa"/>
+            <w:shd w:val="clear" w:color="auto" w:fill="EFF6FF"/>
+            <w:vAlign w:val="top"/>
+            <w:tcMar>
+              <w:top w:w="60" w:type="dxa"/>
+              <w:bottom w:w="60" w:type="dxa"/>
+              <w:left w:w="100" w:type="dxa"/>
+              <w:right w:w="80" w:type="dxa"/>
+            </w:tcMar>
+          </w:tcPr>
+          <w:p>
+            <w:pPr>
+              <w:jc w:val="left"/>
+              <w:spacing w:before="0" w:after="0"/>
+            </w:pPr>
+          </w:p>
+        </w:tc>
+        <w:tc>
+          <w:tcPr>
+            <w:tcW w:w="900" w:type="dxa"/>
+            <w:shd w:val="clear" w:color="auto" w:fill="DBEAFE"/>
+            <w:vAlign w:val="top"/>
+            <w:tcMar>
+              <w:top w:w="60" w:type="dxa"/>
+              <w:bottom w:w="60" w:type="dxa"/>
+              <w:left w:w="100" w:type="dxa"/>
+              <w:right w:w="80" w:type="dxa"/>
+            </w:tcMar>
+          </w:tcPr>
+          <w:p>
+            <w:pPr>
+              <w:jc w:val="left"/>
+              <w:spacing w:before="0" w:after="0"/>
+            </w:pPr>
+          </w:p>
+        </w:tc>
+        <w:tc>
+          <w:tcPr>
+            <w:tcW w:w="600" w:type="dxa"/>
+            <w:shd w:val="clear" w:color="auto" w:fill="DBEAFE"/>
+            <w:vAlign w:val="center"/>
+            <w:tcMar>
+              <w:top w:w="60" w:type="dxa"/>
+              <w:bottom w:w="60" w:type="dxa"/>
+              <w:left w:w="40" w:type="dxa"/>
+              <w:right w:w="40" w:type="dxa"/>
+            </w:tcMar>
+          </w:tcPr>
+          <w:p>
+            <w:pPr>
+              <w:jc w:val="center"/>
+              <w:spacing w:before="0" w:after="0"/>
+            </w:pPr>
+            <w:r>
+              <w:rPr>
+                <w:rFonts w:ascii="Calibri" w:hAnsi="Calibri"/>
+                <w:b/>
+                <w:i w:val="0"/>
+                <w:color w:val="1E3A8A"/>
+                <w:sz w:val="18"/>
+              </w:rPr>
+              <w:t>A</w:t>
+            </w:r>
+          </w:p>
+        </w:tc>
+        <w:tc>
+          <w:tcPr>
+            <w:tcW w:w="4506" w:type="dxa"/>
+            <w:shd w:val="clear" w:color="auto" w:fill="DBEAFE"/>
+            <w:vAlign w:val="top"/>
+            <w:tcMar>
+              <w:top w:w="60" w:type="dxa"/>
+              <w:bottom w:w="60" w:type="dxa"/>
+              <w:left w:w="100" w:type="dxa"/>
+              <w:right w:w="80" w:type="dxa"/>
+            </w:tcMar>
+          </w:tcPr>
+          <w:p>
+            <w:pPr>
+              <w:jc w:val="left"/>
+              <w:spacing w:before="0" w:after="0"/>
+            </w:pPr>
+            <w:r>
+              <w:rPr>
+                <w:rFonts w:ascii="Calibri" w:hAnsi="Calibri"/>
+                <w:b w:val="0"/>
+                <w:i w:val="0"/>
+                <w:color w:val="1E3A8A"/>
+                <w:sz w:val="18"/>
+              </w:rPr>
+              <w:t>Gitar akustik</w:t>
+            </w:r>
+          </w:p>
+        </w:tc>
+        <w:tc>
+          <w:tcPr>
+            <w:tcW w:w="800" w:type="dxa"/>
+            <w:shd w:val="clear" w:color="auto" w:fill="F8FAFC"/>
+            <w:vAlign w:val="center"/>
+            <w:tcMar>
+              <w:top w:w="60" w:type="dxa"/>
+              <w:bottom w:w="60" w:type="dxa"/>
+              <w:left w:w="40" w:type="dxa"/>
+              <w:right w:w="40" w:type="dxa"/>
+            </w:tcMar>
+          </w:tcPr>
+          <w:p>
+            <w:pPr>
+              <w:jc w:val="center"/>
+              <w:spacing w:before="0" w:after="0"/>
+            </w:pPr>
+          </w:p>
+        </w:tc>
+      </w:tr>
+      <w:tr>
+        <w:tc>
+          <w:tcPr>
+            <w:tcW w:w="400" w:type="dxa"/>
+            <w:shd w:val="clear" w:color="auto" w:fill="F1F5F9"/>
+            <w:vAlign w:val="top"/>
+            <w:tcMar>
+              <w:top w:w="60" w:type="dxa"/>
+              <w:bottom w:w="60" w:type="dxa"/>
+              <w:left w:w="100" w:type="dxa"/>
+              <w:right w:w="80" w:type="dxa"/>
+            </w:tcMar>
+          </w:tcPr>
+          <w:p>
+            <w:pPr>
+              <w:jc w:val="left"/>
+              <w:spacing w:before="0" w:after="0"/>
+            </w:pPr>
+          </w:p>
+        </w:tc>
+        <w:tc>
+          <w:tcPr>
+            <w:tcW w:w="3000" w:type="dxa"/>
+            <w:shd w:val="clear" w:color="auto" w:fill="EFF6FF"/>
+            <w:vAlign w:val="top"/>
+            <w:tcMar>
+              <w:top w:w="60" w:type="dxa"/>
+              <w:bottom w:w="60" w:type="dxa"/>
+              <w:left w:w="100" w:type="dxa"/>
+              <w:right w:w="80" w:type="dxa"/>
+            </w:tcMar>
+          </w:tcPr>
+          <w:p>
+            <w:pPr>
+              <w:jc w:val="left"/>
+              <w:spacing w:before="0" w:after="0"/>
+            </w:pPr>
+          </w:p>
+        </w:tc>
+        <w:tc>
+          <w:tcPr>
+            <w:tcW w:w="900" w:type="dxa"/>
+            <w:shd w:val="clear" w:color="auto" w:fill="DCFCE7"/>
+            <w:vAlign w:val="top"/>
+            <w:tcMar>
+              <w:top w:w="60" w:type="dxa"/>
+              <w:bottom w:w="60" w:type="dxa"/>
+              <w:left w:w="100" w:type="dxa"/>
+              <w:right w:w="80" w:type="dxa"/>
+            </w:tcMar>
+          </w:tcPr>
+          <w:p>
+            <w:pPr>
+              <w:jc w:val="left"/>
+              <w:spacing w:before="0" w:after="0"/>
+            </w:pPr>
+          </w:p>
+        </w:tc>
+        <w:tc>
+          <w:tcPr>
+            <w:tcW w:w="600" w:type="dxa"/>
+            <w:shd w:val="clear" w:color="auto" w:fill="DCFCE7"/>
+            <w:vAlign w:val="center"/>
+            <w:tcMar>
+              <w:top w:w="60" w:type="dxa"/>
+              <w:bottom w:w="60" w:type="dxa"/>
+              <w:left w:w="40" w:type="dxa"/>
+              <w:right w:w="40" w:type="dxa"/>
+            </w:tcMar>
+          </w:tcPr>
+          <w:p>
+            <w:pPr>
+              <w:jc w:val="center"/>
+              <w:spacing w:before="0" w:after="0"/>
+            </w:pPr>
+            <w:r>
+              <w:rPr>
+                <w:rFonts w:ascii="Calibri" w:hAnsi="Calibri"/>
+                <w:b/>
+                <w:i w:val="0"/>
+                <w:color w:val="14532D"/>
+                <w:sz w:val="18"/>
+              </w:rPr>
+              <w:t>B</w:t>
+            </w:r>
+          </w:p>
+        </w:tc>
+        <w:tc>
+          <w:tcPr>
+            <w:tcW w:w="4506" w:type="dxa"/>
+            <w:shd w:val="clear" w:color="auto" w:fill="DCFCE7"/>
+            <w:vAlign w:val="top"/>
+            <w:tcMar>
+              <w:top w:w="60" w:type="dxa"/>
+              <w:bottom w:w="60" w:type="dxa"/>
+              <w:left w:w="100" w:type="dxa"/>
+              <w:right w:w="80" w:type="dxa"/>
+            </w:tcMar>
+          </w:tcPr>
+          <w:p>
+            <w:pPr>
+              <w:jc w:val="left"/>
+              <w:spacing w:before="0" w:after="0"/>
+            </w:pPr>
+            <w:r>
+              <w:rPr>
+                <w:rFonts w:ascii="Calibri" w:hAnsi="Calibri"/>
+                <w:b w:val="0"/>
+                <w:i w:val="0"/>
+                <w:color w:val="14532D"/>
+                <w:sz w:val="18"/>
+              </w:rPr>
+              <w:t>Piano</w:t>
+            </w:r>
+          </w:p>
+        </w:tc>
+        <w:tc>
+          <w:tcPr>
+            <w:tcW w:w="800" w:type="dxa"/>
+            <w:shd w:val="clear" w:color="auto" w:fill="F8FAFC"/>
+            <w:vAlign w:val="center"/>
+            <w:tcMar>
+              <w:top w:w="60" w:type="dxa"/>
+              <w:bottom w:w="60" w:type="dxa"/>
+              <w:left w:w="40" w:type="dxa"/>
+              <w:right w:w="40" w:type="dxa"/>
+            </w:tcMar>
+          </w:tcPr>
+          <w:p>
+            <w:pPr>
+              <w:jc w:val="center"/>
+              <w:spacing w:before="0" w:after="0"/>
+            </w:pPr>
+          </w:p>
+        </w:tc>
+      </w:tr>
+      <w:tr>
+        <w:tc>
+          <w:tcPr>
+            <w:tcW w:w="400" w:type="dxa"/>
+            <w:shd w:val="clear" w:color="auto" w:fill="F1F5F9"/>
+            <w:vAlign w:val="top"/>
+            <w:tcMar>
+              <w:top w:w="60" w:type="dxa"/>
+              <w:bottom w:w="60" w:type="dxa"/>
+              <w:left w:w="100" w:type="dxa"/>
+              <w:right w:w="80" w:type="dxa"/>
+            </w:tcMar>
+          </w:tcPr>
+          <w:p>
+            <w:pPr>
+              <w:jc w:val="left"/>
+              <w:spacing w:before="0" w:after="0"/>
+            </w:pPr>
+          </w:p>
+        </w:tc>
+        <w:tc>
+          <w:tcPr>
+            <w:tcW w:w="3000" w:type="dxa"/>
+            <w:shd w:val="clear" w:color="auto" w:fill="EFF6FF"/>
+            <w:vAlign w:val="top"/>
+            <w:tcMar>
+              <w:top w:w="60" w:type="dxa"/>
+              <w:bottom w:w="60" w:type="dxa"/>
+              <w:left w:w="100" w:type="dxa"/>
+              <w:right w:w="80" w:type="dxa"/>
+            </w:tcMar>
+          </w:tcPr>
+          <w:p>
+            <w:pPr>
+              <w:jc w:val="left"/>
+              <w:spacing w:before="0" w:after="0"/>
+            </w:pPr>
+          </w:p>
+        </w:tc>
+        <w:tc>
+          <w:tcPr>
+            <w:tcW w:w="900" w:type="dxa"/>
+            <w:shd w:val="clear" w:color="auto" w:fill="FEF9C3"/>
+            <w:vAlign w:val="top"/>
+            <w:tcMar>
+              <w:top w:w="60" w:type="dxa"/>
+              <w:bottom w:w="60" w:type="dxa"/>
+              <w:left w:w="100" w:type="dxa"/>
+              <w:right w:w="80" w:type="dxa"/>
+            </w:tcMar>
+          </w:tcPr>
+          <w:p>
+            <w:pPr>
+              <w:jc w:val="left"/>
+              <w:spacing w:before="0" w:after="0"/>
+            </w:pPr>
+          </w:p>
+        </w:tc>
+        <w:tc>
+          <w:tcPr>
+            <w:tcW w:w="600" w:type="dxa"/>
+            <w:shd w:val="clear" w:color="auto" w:fill="BBF7D0"/>
+            <w:vAlign w:val="center"/>
+            <w:tcMar>
+              <w:top w:w="60" w:type="dxa"/>
+              <w:bottom w:w="60" w:type="dxa"/>
+              <w:left w:w="40" w:type="dxa"/>
+              <w:right w:w="40" w:type="dxa"/>
+            </w:tcMar>
+          </w:tcPr>
+          <w:p>
+            <w:pPr>
+              <w:jc w:val="center"/>
+              <w:spacing w:before="0" w:after="0"/>
+            </w:pPr>
+            <w:r>
+              <w:rPr>
+                <w:rFonts w:ascii="Calibri" w:hAnsi="Calibri"/>
+                <w:b/>
+                <w:i w:val="0"/>
+                <w:color w:val="166534"/>
+                <w:sz w:val="18"/>
+              </w:rPr>
+              <w:t>C</w:t>
+            </w:r>
+          </w:p>
+        </w:tc>
+        <w:tc>
+          <w:tcPr>
+            <w:tcW w:w="4506" w:type="dxa"/>
+            <w:shd w:val="clear" w:color="auto" w:fill="BBF7D0"/>
+            <w:vAlign w:val="top"/>
+            <w:tcMar>
+              <w:top w:w="60" w:type="dxa"/>
+              <w:bottom w:w="60" w:type="dxa"/>
+              <w:left w:w="100" w:type="dxa"/>
+              <w:right w:w="80" w:type="dxa"/>
+            </w:tcMar>
+          </w:tcPr>
+          <w:p>
+            <w:pPr>
+              <w:jc w:val="left"/>
+              <w:spacing w:before="0" w:after="0"/>
+            </w:pPr>
+            <w:r>
+              <w:rPr>
+                <w:rFonts w:ascii="Calibri" w:hAnsi="Calibri"/>
+                <w:b/>
+                <w:i w:val="0"/>
+                <w:color w:val="166534"/>
+                <w:sz w:val="18"/>
+              </w:rPr>
+              <w:t>Biola</w:t>
+            </w:r>
+          </w:p>
+        </w:tc>
+        <w:tc>
+          <w:tcPr>
+            <w:tcW w:w="800" w:type="dxa"/>
+            <w:shd w:val="clear" w:color="auto" w:fill="BBF7D0"/>
+            <w:vAlign w:val="center"/>
+            <w:tcMar>
+              <w:top w:w="60" w:type="dxa"/>
+              <w:bottom w:w="60" w:type="dxa"/>
+              <w:left w:w="40" w:type="dxa"/>
+              <w:right w:w="40" w:type="dxa"/>
+            </w:tcMar>
+          </w:tcPr>
+          <w:p>
+            <w:pPr>
+              <w:jc w:val="center"/>
+              <w:spacing w:before="0" w:after="0"/>
+            </w:pPr>
+            <w:r>
+              <w:rPr>
+                <w:rFonts w:ascii="Calibri" w:hAnsi="Calibri"/>
+                <w:b/>
+                <w:i w:val="0"/>
+                <w:color w:val="166534"/>
+                <w:sz w:val="20"/>
+              </w:rPr>
+              <w:t>V</w:t>
+            </w:r>
+          </w:p>
+        </w:tc>
+      </w:tr>
+      <w:tr>
+        <w:tc>
+          <w:tcPr>
+            <w:tcW w:w="400" w:type="dxa"/>
+            <w:shd w:val="clear" w:color="auto" w:fill="F1F5F9"/>
+            <w:vAlign w:val="top"/>
+            <w:tcMar>
+              <w:top w:w="60" w:type="dxa"/>
+              <w:bottom w:w="60" w:type="dxa"/>
+              <w:left w:w="100" w:type="dxa"/>
+              <w:right w:w="80" w:type="dxa"/>
+            </w:tcMar>
+          </w:tcPr>
+          <w:p>
+            <w:pPr>
+              <w:jc w:val="left"/>
+              <w:spacing w:before="0" w:after="0"/>
+            </w:pPr>
+          </w:p>
+        </w:tc>
+        <w:tc>
+          <w:tcPr>
+            <w:tcW w:w="3000" w:type="dxa"/>
+            <w:shd w:val="clear" w:color="auto" w:fill="EFF6FF"/>
+            <w:vAlign w:val="top"/>
+            <w:tcMar>
+              <w:top w:w="60" w:type="dxa"/>
+              <w:bottom w:w="60" w:type="dxa"/>
+              <w:left w:w="100" w:type="dxa"/>
+              <w:right w:w="80" w:type="dxa"/>
+            </w:tcMar>
+          </w:tcPr>
+          <w:p>
+            <w:pPr>
+              <w:jc w:val="left"/>
+              <w:spacing w:before="0" w:after="0"/>
+            </w:pPr>
+          </w:p>
+        </w:tc>
+        <w:tc>
+          <w:tcPr>
+            <w:tcW w:w="900" w:type="dxa"/>
+            <w:shd w:val="clear" w:color="auto" w:fill="F3E8FF"/>
+            <w:vAlign w:val="top"/>
+            <w:tcMar>
+              <w:top w:w="60" w:type="dxa"/>
+              <w:bottom w:w="60" w:type="dxa"/>
+              <w:left w:w="100" w:type="dxa"/>
+              <w:right w:w="80" w:type="dxa"/>
+            </w:tcMar>
+          </w:tcPr>
+          <w:p>
+            <w:pPr>
+              <w:jc w:val="left"/>
+              <w:spacing w:before="0" w:after="0"/>
+            </w:pPr>
+          </w:p>
+        </w:tc>
+        <w:tc>
+          <w:tcPr>
+            <w:tcW w:w="600" w:type="dxa"/>
+            <w:shd w:val="clear" w:color="auto" w:fill="F3E8FF"/>
+            <w:vAlign w:val="center"/>
+            <w:tcMar>
+              <w:top w:w="60" w:type="dxa"/>
+              <w:bottom w:w="60" w:type="dxa"/>
+              <w:left w:w="40" w:type="dxa"/>
+              <w:right w:w="40" w:type="dxa"/>
+            </w:tcMar>
+          </w:tcPr>
+          <w:p>
+            <w:pPr>
+              <w:jc w:val="center"/>
+              <w:spacing w:before="0" w:after="0"/>
+            </w:pPr>
+            <w:r>
+              <w:rPr>
+                <w:rFonts w:ascii="Calibri" w:hAnsi="Calibri"/>
+                <w:b/>
+                <w:i w:val="0"/>
+                <w:color w:val="581C87"/>
+                <w:sz w:val="18"/>
+              </w:rPr>
+              <w:t>D</w:t>
+            </w:r>
+          </w:p>
+        </w:tc>
+        <w:tc>
+          <w:tcPr>
+            <w:tcW w:w="4506" w:type="dxa"/>
+            <w:shd w:val="clear" w:color="auto" w:fill="F3E8FF"/>
+            <w:vAlign w:val="top"/>
+            <w:tcMar>
+              <w:top w:w="60" w:type="dxa"/>
+              <w:bottom w:w="60" w:type="dxa"/>
+              <w:left w:w="100" w:type="dxa"/>
+              <w:right w:w="80" w:type="dxa"/>
+            </w:tcMar>
+          </w:tcPr>
+          <w:p>
+            <w:pPr>
+              <w:jc w:val="left"/>
+              <w:spacing w:before="0" w:after="0"/>
+            </w:pPr>
+            <w:r>
+              <w:rPr>
+                <w:rFonts w:ascii="Calibri" w:hAnsi="Calibri"/>
+                <w:b w:val="0"/>
+                <w:i w:val="0"/>
+                <w:color w:val="581C87"/>
+                <w:sz w:val="18"/>
+              </w:rPr>
+              <w:t>Suling bambu</w:t>
+            </w:r>
+          </w:p>
+        </w:tc>
+        <w:tc>
+          <w:tcPr>
+            <w:tcW w:w="800" w:type="dxa"/>
+            <w:shd w:val="clear" w:color="auto" w:fill="F8FAFC"/>
+            <w:vAlign w:val="center"/>
+            <w:tcMar>
+              <w:top w:w="60" w:type="dxa"/>
+              <w:bottom w:w="60" w:type="dxa"/>
+              <w:left w:w="40" w:type="dxa"/>
+              <w:right w:w="40" w:type="dxa"/>
+            </w:tcMar>
+          </w:tcPr>
+          <w:p>
+            <w:pPr>
+              <w:jc w:val="center"/>
+              <w:spacing w:before="0" w:after="0"/>
+            </w:pPr>
+          </w:p>
+        </w:tc>
+      </w:tr>
+      <w:tr>
+        <w:tc>
+          <w:tcPr>
+            <w:tcW w:w="400" w:type="dxa"/>
+            <w:shd w:val="clear" w:color="auto" w:fill="F1F5F9"/>
+            <w:vAlign w:val="top"/>
+            <w:tcMar>
+              <w:top w:w="60" w:type="dxa"/>
+              <w:bottom w:w="60" w:type="dxa"/>
+              <w:left w:w="100" w:type="dxa"/>
+              <w:right w:w="80" w:type="dxa"/>
+            </w:tcMar>
+          </w:tcPr>
+          <w:p>
+            <w:pPr>
+              <w:jc w:val="left"/>
+              <w:spacing w:before="0" w:after="0"/>
+            </w:pPr>
+          </w:p>
+        </w:tc>
+        <w:tc>
+          <w:tcPr>
+            <w:tcW w:w="3000" w:type="dxa"/>
+            <w:shd w:val="clear" w:color="auto" w:fill="EFF6FF"/>
+            <w:vAlign w:val="top"/>
+            <w:tcMar>
+              <w:top w:w="60" w:type="dxa"/>
+              <w:bottom w:w="60" w:type="dxa"/>
+              <w:left w:w="100" w:type="dxa"/>
+              <w:right w:w="80" w:type="dxa"/>
+            </w:tcMar>
+          </w:tcPr>
+          <w:p>
+            <w:pPr>
+              <w:jc w:val="left"/>
+              <w:spacing w:before="0" w:after="0"/>
+            </w:pPr>
+          </w:p>
+        </w:tc>
+        <w:tc>
+          <w:tcPr>
+            <w:tcW w:w="900" w:type="dxa"/>
+            <w:shd w:val="clear" w:color="auto" w:fill="FFE4E6"/>
+            <w:vAlign w:val="top"/>
+            <w:tcMar>
+              <w:top w:w="60" w:type="dxa"/>
+              <w:bottom w:w="60" w:type="dxa"/>
+              <w:left w:w="100" w:type="dxa"/>
+              <w:right w:w="80" w:type="dxa"/>
+            </w:tcMar>
+          </w:tcPr>
+          <w:p>
+            <w:pPr>
+              <w:jc w:val="left"/>
+              <w:spacing w:before="0" w:after="0"/>
+            </w:pPr>
+          </w:p>
+        </w:tc>
+        <w:tc>
+          <w:tcPr>
+            <w:tcW w:w="600" w:type="dxa"/>
+            <w:shd w:val="clear" w:color="auto" w:fill="FFE4E6"/>
+            <w:vAlign w:val="center"/>
+            <w:tcMar>
+              <w:top w:w="60" w:type="dxa"/>
+              <w:bottom w:w="60" w:type="dxa"/>
+              <w:left w:w="40" w:type="dxa"/>
+              <w:right w:w="40" w:type="dxa"/>
+            </w:tcMar>
+          </w:tcPr>
+          <w:p>
+            <w:pPr>
+              <w:jc w:val="center"/>
+              <w:spacing w:before="0" w:after="0"/>
+            </w:pPr>
+            <w:r>
+              <w:rPr>
+                <w:rFonts w:ascii="Calibri" w:hAnsi="Calibri"/>
+                <w:b/>
+                <w:i w:val="0"/>
+                <w:color w:val="881337"/>
+                <w:sz w:val="18"/>
+              </w:rPr>
+              <w:t>E</w:t>
+            </w:r>
+          </w:p>
+        </w:tc>
+        <w:tc>
+          <w:tcPr>
+            <w:tcW w:w="4506" w:type="dxa"/>
+            <w:shd w:val="clear" w:color="auto" w:fill="FFE4E6"/>
+            <w:vAlign w:val="top"/>
+            <w:tcMar>
+              <w:top w:w="60" w:type="dxa"/>
+              <w:bottom w:w="60" w:type="dxa"/>
+              <w:left w:w="100" w:type="dxa"/>
+              <w:right w:w="80" w:type="dxa"/>
+            </w:tcMar>
+          </w:tcPr>
+          <w:p>
+            <w:pPr>
+              <w:jc w:val="left"/>
+              <w:spacing w:before="0" w:after="0"/>
+            </w:pPr>
+            <w:r>
+              <w:rPr>
+                <w:rFonts w:ascii="Calibri" w:hAnsi="Calibri"/>
+                <w:b w:val="0"/>
+                <w:i w:val="0"/>
+                <w:color w:val="881337"/>
+                <w:sz w:val="18"/>
+              </w:rPr>
+              <w:t>Drum</w:t>
+            </w:r>
+          </w:p>
+        </w:tc>
+        <w:tc>
+          <w:tcPr>
+            <w:tcW w:w="800" w:type="dxa"/>
+            <w:shd w:val="clear" w:color="auto" w:fill="F8FAFC"/>
+            <w:vAlign w:val="center"/>
+            <w:tcMar>
+              <w:top w:w="60" w:type="dxa"/>
+              <w:bottom w:w="60" w:type="dxa"/>
+              <w:left w:w="40" w:type="dxa"/>
+              <w:right w:w="40" w:type="dxa"/>
+            </w:tcMar>
+          </w:tcPr>
+          <w:p>
+            <w:pPr>
+              <w:jc w:val="center"/>
+              <w:spacing w:before="0" w:after="0"/>
+            </w:pPr>
+          </w:p>
+        </w:tc>
+      </w:tr>
+      <w:tr>
+        <w:tc>
+          <w:tcPr>
             <w:tcW w:w="10206" w:type="dxa"/>
             <w:gridSpan w:val="6"/>
             <w:shd w:val="clear" w:color="auto" w:fill="1E3A8A"/>
@@ -2171,7 +3050,7 @@
                 <w:color w:val="1E3A8A"/>
                 <w:sz w:val="18"/>
               </w:rPr>
-              <w:t>3</w:t>
+              <w:t>4</w:t>
             </w:r>
           </w:p>
         </w:tc>
@@ -2235,7 +3114,7 @@
         <w:tc>
           <w:tcPr>
             <w:tcW w:w="600" w:type="dxa"/>
-            <w:shd w:val="clear" w:color="auto" w:fill="FFFFFF"/>
+            <w:shd w:val="clear" w:color="auto" w:fill="F8FAFC"/>
             <w:vAlign w:val="top"/>
             <w:tcMar>
               <w:top w:w="60" w:type="dxa"/>
@@ -2254,7 +3133,7 @@
         <w:tc>
           <w:tcPr>
             <w:tcW w:w="4506" w:type="dxa"/>
-            <w:shd w:val="clear" w:color="auto" w:fill="FFFFFF"/>
+            <w:shd w:val="clear" w:color="auto" w:fill="F8FAFC"/>
             <w:vAlign w:val="top"/>
             <w:tcMar>
               <w:top w:w="60" w:type="dxa"/>
@@ -2273,7 +3152,7 @@
         <w:tc>
           <w:tcPr>
             <w:tcW w:w="800" w:type="dxa"/>
-            <w:shd w:val="clear" w:color="auto" w:fill="FFFFFF"/>
+            <w:shd w:val="clear" w:color="auto" w:fill="F8FAFC"/>
             <w:vAlign w:val="top"/>
             <w:tcMar>
               <w:top w:w="60" w:type="dxa"/>
@@ -2313,7 +3192,7 @@
         <w:tc>
           <w:tcPr>
             <w:tcW w:w="3000" w:type="dxa"/>
-            <w:shd w:val="clear" w:color="auto" w:fill="EFF6FF"/>
+            <w:shd w:val="clear" w:color="auto" w:fill="F8FAFC"/>
             <w:vAlign w:val="top"/>
             <w:tcMar>
               <w:top w:w="60" w:type="dxa"/>
@@ -2459,7 +3338,7 @@
         <w:tc>
           <w:tcPr>
             <w:tcW w:w="3000" w:type="dxa"/>
-            <w:shd w:val="clear" w:color="auto" w:fill="EFF6FF"/>
+            <w:shd w:val="clear" w:color="auto" w:fill="F8FAFC"/>
             <w:vAlign w:val="top"/>
             <w:tcMar>
               <w:top w:w="60" w:type="dxa"/>
@@ -2595,7 +3474,7 @@
         <w:tc>
           <w:tcPr>
             <w:tcW w:w="3000" w:type="dxa"/>
-            <w:shd w:val="clear" w:color="auto" w:fill="EFF6FF"/>
+            <w:shd w:val="clear" w:color="auto" w:fill="F8FAFC"/>
             <w:vAlign w:val="top"/>
             <w:tcMar>
               <w:top w:w="60" w:type="dxa"/>
@@ -2741,7 +3620,7 @@
         <w:tc>
           <w:tcPr>
             <w:tcW w:w="3000" w:type="dxa"/>
-            <w:shd w:val="clear" w:color="auto" w:fill="EFF6FF"/>
+            <w:shd w:val="clear" w:color="auto" w:fill="F8FAFC"/>
             <w:vAlign w:val="top"/>
             <w:tcMar>
               <w:top w:w="60" w:type="dxa"/>
@@ -2877,7 +3756,7 @@
         <w:tc>
           <w:tcPr>
             <w:tcW w:w="3000" w:type="dxa"/>
-            <w:shd w:val="clear" w:color="auto" w:fill="EFF6FF"/>
+            <w:shd w:val="clear" w:color="auto" w:fill="F8FAFC"/>
             <w:vAlign w:val="top"/>
             <w:tcMar>
               <w:top w:w="60" w:type="dxa"/>
@@ -3003,6 +3882,1770 @@
       <w:tr>
         <w:tc>
           <w:tcPr>
+            <w:tcW w:w="400" w:type="dxa"/>
+            <w:shd w:val="clear" w:color="auto" w:fill="F1F5F9"/>
+            <w:vAlign w:val="top"/>
+            <w:tcMar>
+              <w:top w:w="80" w:type="dxa"/>
+              <w:bottom w:w="60" w:type="dxa"/>
+              <w:left w:w="60" w:type="dxa"/>
+              <w:right w:w="60" w:type="dxa"/>
+            </w:tcMar>
+          </w:tcPr>
+          <w:p>
+            <w:pPr>
+              <w:jc w:val="center"/>
+              <w:spacing w:before="0" w:after="0"/>
+            </w:pPr>
+            <w:r>
+              <w:rPr>
+                <w:rFonts w:ascii="Calibri" w:hAnsi="Calibri"/>
+                <w:b/>
+                <w:i w:val="0"/>
+                <w:color w:val="1E3A8A"/>
+                <w:sz w:val="18"/>
+              </w:rPr>
+              <w:t>5</w:t>
+            </w:r>
+          </w:p>
+        </w:tc>
+        <w:tc>
+          <w:tcPr>
+            <w:tcW w:w="3000" w:type="dxa"/>
+            <w:shd w:val="clear" w:color="auto" w:fill="EFF6FF"/>
+            <w:vAlign w:val="top"/>
+            <w:tcMar>
+              <w:top w:w="80" w:type="dxa"/>
+              <w:bottom w:w="60" w:type="dxa"/>
+              <w:left w:w="100" w:type="dxa"/>
+              <w:right w:w="80" w:type="dxa"/>
+            </w:tcMar>
+          </w:tcPr>
+          <w:p>
+            <w:pPr>
+              <w:spacing w:before="0" w:after="0"/>
+            </w:pPr>
+            <w:r>
+              <w:rPr>
+                <w:rFonts w:ascii="Calibri" w:hAnsi="Calibri"/>
+                <w:b w:val="0"/>
+                <w:i w:val="0"/>
+                <w:color w:val="374151"/>
+                <w:sz w:val="19"/>
+              </w:rPr>
+              <w:t>Perhatikan gambar sistem tata surya berikut!</w:t>
+              <w:br/>
+              <w:t>MEDIA: https://example.com/img/tata-surya.jpg</w:t>
+              <w:br/>
+              <w:t>Manakah yang termasuk planet dalam (inner planet)? (Pilih semua yang benar)</w:t>
+            </w:r>
+          </w:p>
+          <w:p>
+            <w:pPr>
+              <w:spacing w:before="60" w:after="0"/>
+              <w:jc w:val="left"/>
+            </w:pPr>
+            <w:r>
+              <w:drawing>
+                <wp:inline xmlns:a="http://schemas.openxmlformats.org/drawingml/2006/main" xmlns:pic="http://schemas.openxmlformats.org/drawingml/2006/picture">
+                  <wp:extent cx="1620000" cy="810000"/>
+                  <wp:docPr id="3" name="Picture 3"/>
+                  <wp:cNvGraphicFramePr>
+                    <a:graphicFrameLocks noChangeAspect="1"/>
+                  </wp:cNvGraphicFramePr>
+                  <a:graphic>
+                    <a:graphicData uri="http://schemas.openxmlformats.org/drawingml/2006/picture">
+                      <pic:pic>
+                        <pic:nvPicPr>
+                          <pic:cNvPr id="0" name="image.png"/>
+                          <pic:cNvPicPr/>
+                        </pic:nvPicPr>
+                        <pic:blipFill>
+                          <a:blip r:embed="rId11"/>
+                          <a:stretch>
+                            <a:fillRect/>
+                          </a:stretch>
+                        </pic:blipFill>
+                        <pic:spPr>
+                          <a:xfrm>
+                            <a:off x="0" y="0"/>
+                            <a:ext cx="1620000" cy="810000"/>
+                          </a:xfrm>
+                          <a:prstGeom prst="rect"/>
+                        </pic:spPr>
+                      </pic:pic>
+                    </a:graphicData>
+                  </a:graphic>
+                </wp:inline>
+              </w:drawing>
+            </w:r>
+          </w:p>
+        </w:tc>
+        <w:tc>
+          <w:tcPr>
+            <w:tcW w:w="900" w:type="dxa"/>
+            <w:shd w:val="clear" w:color="auto" w:fill="C4B5FD"/>
+            <w:vAlign w:val="center"/>
+            <w:tcMar>
+              <w:top w:w="80" w:type="dxa"/>
+              <w:bottom w:w="80" w:type="dxa"/>
+              <w:left w:w="60" w:type="dxa"/>
+              <w:right w:w="60" w:type="dxa"/>
+            </w:tcMar>
+          </w:tcPr>
+          <w:p>
+            <w:pPr>
+              <w:jc w:val="center"/>
+              <w:spacing w:before="0" w:after="0"/>
+            </w:pPr>
+            <w:r>
+              <w:rPr>
+                <w:rFonts w:ascii="Calibri" w:hAnsi="Calibri"/>
+                <w:b/>
+                <w:i w:val="0"/>
+                <w:color w:val="1E3A8A"/>
+                <w:sz w:val="16"/>
+              </w:rPr>
+              <w:t>PG+</w:t>
+            </w:r>
+          </w:p>
+        </w:tc>
+        <w:tc>
+          <w:tcPr>
+            <w:tcW w:w="600" w:type="dxa"/>
+            <w:shd w:val="clear" w:color="auto" w:fill="FFFFFF"/>
+            <w:vAlign w:val="top"/>
+            <w:tcMar>
+              <w:top w:w="60" w:type="dxa"/>
+              <w:bottom w:w="60" w:type="dxa"/>
+              <w:left w:w="100" w:type="dxa"/>
+              <w:right w:w="80" w:type="dxa"/>
+            </w:tcMar>
+          </w:tcPr>
+          <w:p>
+            <w:pPr>
+              <w:jc w:val="left"/>
+              <w:spacing w:before="0" w:after="0"/>
+            </w:pPr>
+          </w:p>
+        </w:tc>
+        <w:tc>
+          <w:tcPr>
+            <w:tcW w:w="4506" w:type="dxa"/>
+            <w:shd w:val="clear" w:color="auto" w:fill="FFFFFF"/>
+            <w:vAlign w:val="top"/>
+            <w:tcMar>
+              <w:top w:w="60" w:type="dxa"/>
+              <w:bottom w:w="60" w:type="dxa"/>
+              <w:left w:w="100" w:type="dxa"/>
+              <w:right w:w="80" w:type="dxa"/>
+            </w:tcMar>
+          </w:tcPr>
+          <w:p>
+            <w:pPr>
+              <w:jc w:val="left"/>
+              <w:spacing w:before="0" w:after="0"/>
+            </w:pPr>
+          </w:p>
+        </w:tc>
+        <w:tc>
+          <w:tcPr>
+            <w:tcW w:w="800" w:type="dxa"/>
+            <w:shd w:val="clear" w:color="auto" w:fill="FFFFFF"/>
+            <w:vAlign w:val="top"/>
+            <w:tcMar>
+              <w:top w:w="60" w:type="dxa"/>
+              <w:bottom w:w="60" w:type="dxa"/>
+              <w:left w:w="100" w:type="dxa"/>
+              <w:right w:w="80" w:type="dxa"/>
+            </w:tcMar>
+          </w:tcPr>
+          <w:p>
+            <w:pPr>
+              <w:jc w:val="left"/>
+              <w:spacing w:before="0" w:after="0"/>
+            </w:pPr>
+          </w:p>
+        </w:tc>
+      </w:tr>
+      <w:tr>
+        <w:tc>
+          <w:tcPr>
+            <w:tcW w:w="400" w:type="dxa"/>
+            <w:shd w:val="clear" w:color="auto" w:fill="F1F5F9"/>
+            <w:vAlign w:val="top"/>
+            <w:tcMar>
+              <w:top w:w="60" w:type="dxa"/>
+              <w:bottom w:w="60" w:type="dxa"/>
+              <w:left w:w="100" w:type="dxa"/>
+              <w:right w:w="80" w:type="dxa"/>
+            </w:tcMar>
+          </w:tcPr>
+          <w:p>
+            <w:pPr>
+              <w:jc w:val="left"/>
+              <w:spacing w:before="0" w:after="0"/>
+            </w:pPr>
+          </w:p>
+        </w:tc>
+        <w:tc>
+          <w:tcPr>
+            <w:tcW w:w="3000" w:type="dxa"/>
+            <w:shd w:val="clear" w:color="auto" w:fill="EFF6FF"/>
+            <w:vAlign w:val="top"/>
+            <w:tcMar>
+              <w:top w:w="60" w:type="dxa"/>
+              <w:bottom w:w="60" w:type="dxa"/>
+              <w:left w:w="100" w:type="dxa"/>
+              <w:right w:w="80" w:type="dxa"/>
+            </w:tcMar>
+          </w:tcPr>
+          <w:p>
+            <w:pPr>
+              <w:jc w:val="left"/>
+              <w:spacing w:before="0" w:after="0"/>
+            </w:pPr>
+          </w:p>
+        </w:tc>
+        <w:tc>
+          <w:tcPr>
+            <w:tcW w:w="900" w:type="dxa"/>
+            <w:shd w:val="clear" w:color="auto" w:fill="DBEAFE"/>
+            <w:vAlign w:val="top"/>
+            <w:tcMar>
+              <w:top w:w="60" w:type="dxa"/>
+              <w:bottom w:w="60" w:type="dxa"/>
+              <w:left w:w="100" w:type="dxa"/>
+              <w:right w:w="80" w:type="dxa"/>
+            </w:tcMar>
+          </w:tcPr>
+          <w:p>
+            <w:pPr>
+              <w:jc w:val="left"/>
+              <w:spacing w:before="0" w:after="0"/>
+            </w:pPr>
+          </w:p>
+        </w:tc>
+        <w:tc>
+          <w:tcPr>
+            <w:tcW w:w="600" w:type="dxa"/>
+            <w:shd w:val="clear" w:color="auto" w:fill="BBF7D0"/>
+            <w:vAlign w:val="center"/>
+            <w:tcMar>
+              <w:top w:w="60" w:type="dxa"/>
+              <w:bottom w:w="60" w:type="dxa"/>
+              <w:left w:w="40" w:type="dxa"/>
+              <w:right w:w="40" w:type="dxa"/>
+            </w:tcMar>
+          </w:tcPr>
+          <w:p>
+            <w:pPr>
+              <w:jc w:val="center"/>
+              <w:spacing w:before="0" w:after="0"/>
+            </w:pPr>
+            <w:r>
+              <w:rPr>
+                <w:rFonts w:ascii="Calibri" w:hAnsi="Calibri"/>
+                <w:b/>
+                <w:i w:val="0"/>
+                <w:color w:val="166534"/>
+                <w:sz w:val="18"/>
+              </w:rPr>
+              <w:t>A</w:t>
+            </w:r>
+          </w:p>
+        </w:tc>
+        <w:tc>
+          <w:tcPr>
+            <w:tcW w:w="4506" w:type="dxa"/>
+            <w:shd w:val="clear" w:color="auto" w:fill="BBF7D0"/>
+            <w:vAlign w:val="top"/>
+            <w:tcMar>
+              <w:top w:w="60" w:type="dxa"/>
+              <w:bottom w:w="60" w:type="dxa"/>
+              <w:left w:w="100" w:type="dxa"/>
+              <w:right w:w="80" w:type="dxa"/>
+            </w:tcMar>
+          </w:tcPr>
+          <w:p>
+            <w:pPr>
+              <w:jc w:val="left"/>
+              <w:spacing w:before="0" w:after="0"/>
+            </w:pPr>
+            <w:r>
+              <w:rPr>
+                <w:rFonts w:ascii="Calibri" w:hAnsi="Calibri"/>
+                <w:b/>
+                <w:i w:val="0"/>
+                <w:color w:val="166534"/>
+                <w:sz w:val="18"/>
+              </w:rPr>
+              <w:t>Merkurius</w:t>
+            </w:r>
+          </w:p>
+        </w:tc>
+        <w:tc>
+          <w:tcPr>
+            <w:tcW w:w="800" w:type="dxa"/>
+            <w:shd w:val="clear" w:color="auto" w:fill="BBF7D0"/>
+            <w:vAlign w:val="center"/>
+            <w:tcMar>
+              <w:top w:w="60" w:type="dxa"/>
+              <w:bottom w:w="60" w:type="dxa"/>
+              <w:left w:w="40" w:type="dxa"/>
+              <w:right w:w="40" w:type="dxa"/>
+            </w:tcMar>
+          </w:tcPr>
+          <w:p>
+            <w:pPr>
+              <w:jc w:val="center"/>
+              <w:spacing w:before="0" w:after="0"/>
+            </w:pPr>
+            <w:r>
+              <w:rPr>
+                <w:rFonts w:ascii="Calibri" w:hAnsi="Calibri"/>
+                <w:b/>
+                <w:i w:val="0"/>
+                <w:color w:val="166534"/>
+                <w:sz w:val="20"/>
+              </w:rPr>
+              <w:t>V</w:t>
+            </w:r>
+          </w:p>
+        </w:tc>
+      </w:tr>
+      <w:tr>
+        <w:tc>
+          <w:tcPr>
+            <w:tcW w:w="400" w:type="dxa"/>
+            <w:shd w:val="clear" w:color="auto" w:fill="F1F5F9"/>
+            <w:vAlign w:val="top"/>
+            <w:tcMar>
+              <w:top w:w="60" w:type="dxa"/>
+              <w:bottom w:w="60" w:type="dxa"/>
+              <w:left w:w="100" w:type="dxa"/>
+              <w:right w:w="80" w:type="dxa"/>
+            </w:tcMar>
+          </w:tcPr>
+          <w:p>
+            <w:pPr>
+              <w:jc w:val="left"/>
+              <w:spacing w:before="0" w:after="0"/>
+            </w:pPr>
+          </w:p>
+        </w:tc>
+        <w:tc>
+          <w:tcPr>
+            <w:tcW w:w="3000" w:type="dxa"/>
+            <w:shd w:val="clear" w:color="auto" w:fill="EFF6FF"/>
+            <w:vAlign w:val="top"/>
+            <w:tcMar>
+              <w:top w:w="60" w:type="dxa"/>
+              <w:bottom w:w="60" w:type="dxa"/>
+              <w:left w:w="100" w:type="dxa"/>
+              <w:right w:w="80" w:type="dxa"/>
+            </w:tcMar>
+          </w:tcPr>
+          <w:p>
+            <w:pPr>
+              <w:jc w:val="left"/>
+              <w:spacing w:before="0" w:after="0"/>
+            </w:pPr>
+          </w:p>
+        </w:tc>
+        <w:tc>
+          <w:tcPr>
+            <w:tcW w:w="900" w:type="dxa"/>
+            <w:shd w:val="clear" w:color="auto" w:fill="DCFCE7"/>
+            <w:vAlign w:val="top"/>
+            <w:tcMar>
+              <w:top w:w="60" w:type="dxa"/>
+              <w:bottom w:w="60" w:type="dxa"/>
+              <w:left w:w="100" w:type="dxa"/>
+              <w:right w:w="80" w:type="dxa"/>
+            </w:tcMar>
+          </w:tcPr>
+          <w:p>
+            <w:pPr>
+              <w:jc w:val="left"/>
+              <w:spacing w:before="0" w:after="0"/>
+            </w:pPr>
+          </w:p>
+        </w:tc>
+        <w:tc>
+          <w:tcPr>
+            <w:tcW w:w="600" w:type="dxa"/>
+            <w:shd w:val="clear" w:color="auto" w:fill="BBF7D0"/>
+            <w:vAlign w:val="center"/>
+            <w:tcMar>
+              <w:top w:w="60" w:type="dxa"/>
+              <w:bottom w:w="60" w:type="dxa"/>
+              <w:left w:w="40" w:type="dxa"/>
+              <w:right w:w="40" w:type="dxa"/>
+            </w:tcMar>
+          </w:tcPr>
+          <w:p>
+            <w:pPr>
+              <w:jc w:val="center"/>
+              <w:spacing w:before="0" w:after="0"/>
+            </w:pPr>
+            <w:r>
+              <w:rPr>
+                <w:rFonts w:ascii="Calibri" w:hAnsi="Calibri"/>
+                <w:b/>
+                <w:i w:val="0"/>
+                <w:color w:val="166534"/>
+                <w:sz w:val="18"/>
+              </w:rPr>
+              <w:t>B</w:t>
+            </w:r>
+          </w:p>
+        </w:tc>
+        <w:tc>
+          <w:tcPr>
+            <w:tcW w:w="4506" w:type="dxa"/>
+            <w:shd w:val="clear" w:color="auto" w:fill="BBF7D0"/>
+            <w:vAlign w:val="top"/>
+            <w:tcMar>
+              <w:top w:w="60" w:type="dxa"/>
+              <w:bottom w:w="60" w:type="dxa"/>
+              <w:left w:w="100" w:type="dxa"/>
+              <w:right w:w="80" w:type="dxa"/>
+            </w:tcMar>
+          </w:tcPr>
+          <w:p>
+            <w:pPr>
+              <w:jc w:val="left"/>
+              <w:spacing w:before="0" w:after="0"/>
+            </w:pPr>
+            <w:r>
+              <w:rPr>
+                <w:rFonts w:ascii="Calibri" w:hAnsi="Calibri"/>
+                <w:b/>
+                <w:i w:val="0"/>
+                <w:color w:val="166534"/>
+                <w:sz w:val="18"/>
+              </w:rPr>
+              <w:t>Venus</w:t>
+            </w:r>
+          </w:p>
+        </w:tc>
+        <w:tc>
+          <w:tcPr>
+            <w:tcW w:w="800" w:type="dxa"/>
+            <w:shd w:val="clear" w:color="auto" w:fill="BBF7D0"/>
+            <w:vAlign w:val="center"/>
+            <w:tcMar>
+              <w:top w:w="60" w:type="dxa"/>
+              <w:bottom w:w="60" w:type="dxa"/>
+              <w:left w:w="40" w:type="dxa"/>
+              <w:right w:w="40" w:type="dxa"/>
+            </w:tcMar>
+          </w:tcPr>
+          <w:p>
+            <w:pPr>
+              <w:jc w:val="center"/>
+              <w:spacing w:before="0" w:after="0"/>
+            </w:pPr>
+            <w:r>
+              <w:rPr>
+                <w:rFonts w:ascii="Calibri" w:hAnsi="Calibri"/>
+                <w:b/>
+                <w:i w:val="0"/>
+                <w:color w:val="166534"/>
+                <w:sz w:val="20"/>
+              </w:rPr>
+              <w:t>V</w:t>
+            </w:r>
+          </w:p>
+        </w:tc>
+      </w:tr>
+      <w:tr>
+        <w:tc>
+          <w:tcPr>
+            <w:tcW w:w="400" w:type="dxa"/>
+            <w:shd w:val="clear" w:color="auto" w:fill="F1F5F9"/>
+            <w:vAlign w:val="top"/>
+            <w:tcMar>
+              <w:top w:w="60" w:type="dxa"/>
+              <w:bottom w:w="60" w:type="dxa"/>
+              <w:left w:w="100" w:type="dxa"/>
+              <w:right w:w="80" w:type="dxa"/>
+            </w:tcMar>
+          </w:tcPr>
+          <w:p>
+            <w:pPr>
+              <w:jc w:val="left"/>
+              <w:spacing w:before="0" w:after="0"/>
+            </w:pPr>
+          </w:p>
+        </w:tc>
+        <w:tc>
+          <w:tcPr>
+            <w:tcW w:w="3000" w:type="dxa"/>
+            <w:shd w:val="clear" w:color="auto" w:fill="EFF6FF"/>
+            <w:vAlign w:val="top"/>
+            <w:tcMar>
+              <w:top w:w="60" w:type="dxa"/>
+              <w:bottom w:w="60" w:type="dxa"/>
+              <w:left w:w="100" w:type="dxa"/>
+              <w:right w:w="80" w:type="dxa"/>
+            </w:tcMar>
+          </w:tcPr>
+          <w:p>
+            <w:pPr>
+              <w:jc w:val="left"/>
+              <w:spacing w:before="0" w:after="0"/>
+            </w:pPr>
+          </w:p>
+        </w:tc>
+        <w:tc>
+          <w:tcPr>
+            <w:tcW w:w="900" w:type="dxa"/>
+            <w:shd w:val="clear" w:color="auto" w:fill="FEF9C3"/>
+            <w:vAlign w:val="top"/>
+            <w:tcMar>
+              <w:top w:w="60" w:type="dxa"/>
+              <w:bottom w:w="60" w:type="dxa"/>
+              <w:left w:w="100" w:type="dxa"/>
+              <w:right w:w="80" w:type="dxa"/>
+            </w:tcMar>
+          </w:tcPr>
+          <w:p>
+            <w:pPr>
+              <w:jc w:val="left"/>
+              <w:spacing w:before="0" w:after="0"/>
+            </w:pPr>
+          </w:p>
+        </w:tc>
+        <w:tc>
+          <w:tcPr>
+            <w:tcW w:w="600" w:type="dxa"/>
+            <w:shd w:val="clear" w:color="auto" w:fill="BBF7D0"/>
+            <w:vAlign w:val="center"/>
+            <w:tcMar>
+              <w:top w:w="60" w:type="dxa"/>
+              <w:bottom w:w="60" w:type="dxa"/>
+              <w:left w:w="40" w:type="dxa"/>
+              <w:right w:w="40" w:type="dxa"/>
+            </w:tcMar>
+          </w:tcPr>
+          <w:p>
+            <w:pPr>
+              <w:jc w:val="center"/>
+              <w:spacing w:before="0" w:after="0"/>
+            </w:pPr>
+            <w:r>
+              <w:rPr>
+                <w:rFonts w:ascii="Calibri" w:hAnsi="Calibri"/>
+                <w:b/>
+                <w:i w:val="0"/>
+                <w:color w:val="166534"/>
+                <w:sz w:val="18"/>
+              </w:rPr>
+              <w:t>C</w:t>
+            </w:r>
+          </w:p>
+        </w:tc>
+        <w:tc>
+          <w:tcPr>
+            <w:tcW w:w="4506" w:type="dxa"/>
+            <w:shd w:val="clear" w:color="auto" w:fill="BBF7D0"/>
+            <w:vAlign w:val="top"/>
+            <w:tcMar>
+              <w:top w:w="60" w:type="dxa"/>
+              <w:bottom w:w="60" w:type="dxa"/>
+              <w:left w:w="100" w:type="dxa"/>
+              <w:right w:w="80" w:type="dxa"/>
+            </w:tcMar>
+          </w:tcPr>
+          <w:p>
+            <w:pPr>
+              <w:jc w:val="left"/>
+              <w:spacing w:before="0" w:after="0"/>
+            </w:pPr>
+            <w:r>
+              <w:rPr>
+                <w:rFonts w:ascii="Calibri" w:hAnsi="Calibri"/>
+                <w:b/>
+                <w:i w:val="0"/>
+                <w:color w:val="166534"/>
+                <w:sz w:val="18"/>
+              </w:rPr>
+              <w:t>Bumi</w:t>
+            </w:r>
+          </w:p>
+        </w:tc>
+        <w:tc>
+          <w:tcPr>
+            <w:tcW w:w="800" w:type="dxa"/>
+            <w:shd w:val="clear" w:color="auto" w:fill="BBF7D0"/>
+            <w:vAlign w:val="center"/>
+            <w:tcMar>
+              <w:top w:w="60" w:type="dxa"/>
+              <w:bottom w:w="60" w:type="dxa"/>
+              <w:left w:w="40" w:type="dxa"/>
+              <w:right w:w="40" w:type="dxa"/>
+            </w:tcMar>
+          </w:tcPr>
+          <w:p>
+            <w:pPr>
+              <w:jc w:val="center"/>
+              <w:spacing w:before="0" w:after="0"/>
+            </w:pPr>
+            <w:r>
+              <w:rPr>
+                <w:rFonts w:ascii="Calibri" w:hAnsi="Calibri"/>
+                <w:b/>
+                <w:i w:val="0"/>
+                <w:color w:val="166534"/>
+                <w:sz w:val="20"/>
+              </w:rPr>
+              <w:t>V</w:t>
+            </w:r>
+          </w:p>
+        </w:tc>
+      </w:tr>
+      <w:tr>
+        <w:tc>
+          <w:tcPr>
+            <w:tcW w:w="400" w:type="dxa"/>
+            <w:shd w:val="clear" w:color="auto" w:fill="F1F5F9"/>
+            <w:vAlign w:val="top"/>
+            <w:tcMar>
+              <w:top w:w="60" w:type="dxa"/>
+              <w:bottom w:w="60" w:type="dxa"/>
+              <w:left w:w="100" w:type="dxa"/>
+              <w:right w:w="80" w:type="dxa"/>
+            </w:tcMar>
+          </w:tcPr>
+          <w:p>
+            <w:pPr>
+              <w:jc w:val="left"/>
+              <w:spacing w:before="0" w:after="0"/>
+            </w:pPr>
+          </w:p>
+        </w:tc>
+        <w:tc>
+          <w:tcPr>
+            <w:tcW w:w="3000" w:type="dxa"/>
+            <w:shd w:val="clear" w:color="auto" w:fill="EFF6FF"/>
+            <w:vAlign w:val="top"/>
+            <w:tcMar>
+              <w:top w:w="60" w:type="dxa"/>
+              <w:bottom w:w="60" w:type="dxa"/>
+              <w:left w:w="100" w:type="dxa"/>
+              <w:right w:w="80" w:type="dxa"/>
+            </w:tcMar>
+          </w:tcPr>
+          <w:p>
+            <w:pPr>
+              <w:jc w:val="left"/>
+              <w:spacing w:before="0" w:after="0"/>
+            </w:pPr>
+          </w:p>
+        </w:tc>
+        <w:tc>
+          <w:tcPr>
+            <w:tcW w:w="900" w:type="dxa"/>
+            <w:shd w:val="clear" w:color="auto" w:fill="F3E8FF"/>
+            <w:vAlign w:val="top"/>
+            <w:tcMar>
+              <w:top w:w="60" w:type="dxa"/>
+              <w:bottom w:w="60" w:type="dxa"/>
+              <w:left w:w="100" w:type="dxa"/>
+              <w:right w:w="80" w:type="dxa"/>
+            </w:tcMar>
+          </w:tcPr>
+          <w:p>
+            <w:pPr>
+              <w:jc w:val="left"/>
+              <w:spacing w:before="0" w:after="0"/>
+            </w:pPr>
+          </w:p>
+        </w:tc>
+        <w:tc>
+          <w:tcPr>
+            <w:tcW w:w="600" w:type="dxa"/>
+            <w:shd w:val="clear" w:color="auto" w:fill="BBF7D0"/>
+            <w:vAlign w:val="center"/>
+            <w:tcMar>
+              <w:top w:w="60" w:type="dxa"/>
+              <w:bottom w:w="60" w:type="dxa"/>
+              <w:left w:w="40" w:type="dxa"/>
+              <w:right w:w="40" w:type="dxa"/>
+            </w:tcMar>
+          </w:tcPr>
+          <w:p>
+            <w:pPr>
+              <w:jc w:val="center"/>
+              <w:spacing w:before="0" w:after="0"/>
+            </w:pPr>
+            <w:r>
+              <w:rPr>
+                <w:rFonts w:ascii="Calibri" w:hAnsi="Calibri"/>
+                <w:b/>
+                <w:i w:val="0"/>
+                <w:color w:val="166534"/>
+                <w:sz w:val="18"/>
+              </w:rPr>
+              <w:t>D</w:t>
+            </w:r>
+          </w:p>
+        </w:tc>
+        <w:tc>
+          <w:tcPr>
+            <w:tcW w:w="4506" w:type="dxa"/>
+            <w:shd w:val="clear" w:color="auto" w:fill="BBF7D0"/>
+            <w:vAlign w:val="top"/>
+            <w:tcMar>
+              <w:top w:w="60" w:type="dxa"/>
+              <w:bottom w:w="60" w:type="dxa"/>
+              <w:left w:w="100" w:type="dxa"/>
+              <w:right w:w="80" w:type="dxa"/>
+            </w:tcMar>
+          </w:tcPr>
+          <w:p>
+            <w:pPr>
+              <w:jc w:val="left"/>
+              <w:spacing w:before="0" w:after="0"/>
+            </w:pPr>
+            <w:r>
+              <w:rPr>
+                <w:rFonts w:ascii="Calibri" w:hAnsi="Calibri"/>
+                <w:b/>
+                <w:i w:val="0"/>
+                <w:color w:val="166534"/>
+                <w:sz w:val="18"/>
+              </w:rPr>
+              <w:t>Mars</w:t>
+            </w:r>
+          </w:p>
+        </w:tc>
+        <w:tc>
+          <w:tcPr>
+            <w:tcW w:w="800" w:type="dxa"/>
+            <w:shd w:val="clear" w:color="auto" w:fill="BBF7D0"/>
+            <w:vAlign w:val="center"/>
+            <w:tcMar>
+              <w:top w:w="60" w:type="dxa"/>
+              <w:bottom w:w="60" w:type="dxa"/>
+              <w:left w:w="40" w:type="dxa"/>
+              <w:right w:w="40" w:type="dxa"/>
+            </w:tcMar>
+          </w:tcPr>
+          <w:p>
+            <w:pPr>
+              <w:jc w:val="center"/>
+              <w:spacing w:before="0" w:after="0"/>
+            </w:pPr>
+            <w:r>
+              <w:rPr>
+                <w:rFonts w:ascii="Calibri" w:hAnsi="Calibri"/>
+                <w:b/>
+                <w:i w:val="0"/>
+                <w:color w:val="166534"/>
+                <w:sz w:val="20"/>
+              </w:rPr>
+              <w:t>V</w:t>
+            </w:r>
+          </w:p>
+        </w:tc>
+      </w:tr>
+      <w:tr>
+        <w:tc>
+          <w:tcPr>
+            <w:tcW w:w="400" w:type="dxa"/>
+            <w:shd w:val="clear" w:color="auto" w:fill="F1F5F9"/>
+            <w:vAlign w:val="top"/>
+            <w:tcMar>
+              <w:top w:w="60" w:type="dxa"/>
+              <w:bottom w:w="60" w:type="dxa"/>
+              <w:left w:w="100" w:type="dxa"/>
+              <w:right w:w="80" w:type="dxa"/>
+            </w:tcMar>
+          </w:tcPr>
+          <w:p>
+            <w:pPr>
+              <w:jc w:val="left"/>
+              <w:spacing w:before="0" w:after="0"/>
+            </w:pPr>
+          </w:p>
+        </w:tc>
+        <w:tc>
+          <w:tcPr>
+            <w:tcW w:w="3000" w:type="dxa"/>
+            <w:shd w:val="clear" w:color="auto" w:fill="EFF6FF"/>
+            <w:vAlign w:val="top"/>
+            <w:tcMar>
+              <w:top w:w="60" w:type="dxa"/>
+              <w:bottom w:w="60" w:type="dxa"/>
+              <w:left w:w="100" w:type="dxa"/>
+              <w:right w:w="80" w:type="dxa"/>
+            </w:tcMar>
+          </w:tcPr>
+          <w:p>
+            <w:pPr>
+              <w:jc w:val="left"/>
+              <w:spacing w:before="0" w:after="0"/>
+            </w:pPr>
+          </w:p>
+        </w:tc>
+        <w:tc>
+          <w:tcPr>
+            <w:tcW w:w="900" w:type="dxa"/>
+            <w:shd w:val="clear" w:color="auto" w:fill="FFE4E6"/>
+            <w:vAlign w:val="top"/>
+            <w:tcMar>
+              <w:top w:w="60" w:type="dxa"/>
+              <w:bottom w:w="60" w:type="dxa"/>
+              <w:left w:w="100" w:type="dxa"/>
+              <w:right w:w="80" w:type="dxa"/>
+            </w:tcMar>
+          </w:tcPr>
+          <w:p>
+            <w:pPr>
+              <w:jc w:val="left"/>
+              <w:spacing w:before="0" w:after="0"/>
+            </w:pPr>
+          </w:p>
+        </w:tc>
+        <w:tc>
+          <w:tcPr>
+            <w:tcW w:w="600" w:type="dxa"/>
+            <w:shd w:val="clear" w:color="auto" w:fill="FFE4E6"/>
+            <w:vAlign w:val="center"/>
+            <w:tcMar>
+              <w:top w:w="60" w:type="dxa"/>
+              <w:bottom w:w="60" w:type="dxa"/>
+              <w:left w:w="40" w:type="dxa"/>
+              <w:right w:w="40" w:type="dxa"/>
+            </w:tcMar>
+          </w:tcPr>
+          <w:p>
+            <w:pPr>
+              <w:jc w:val="center"/>
+              <w:spacing w:before="0" w:after="0"/>
+            </w:pPr>
+            <w:r>
+              <w:rPr>
+                <w:rFonts w:ascii="Calibri" w:hAnsi="Calibri"/>
+                <w:b/>
+                <w:i w:val="0"/>
+                <w:color w:val="881337"/>
+                <w:sz w:val="18"/>
+              </w:rPr>
+              <w:t>E</w:t>
+            </w:r>
+          </w:p>
+        </w:tc>
+        <w:tc>
+          <w:tcPr>
+            <w:tcW w:w="4506" w:type="dxa"/>
+            <w:shd w:val="clear" w:color="auto" w:fill="FFE4E6"/>
+            <w:vAlign w:val="top"/>
+            <w:tcMar>
+              <w:top w:w="60" w:type="dxa"/>
+              <w:bottom w:w="60" w:type="dxa"/>
+              <w:left w:w="100" w:type="dxa"/>
+              <w:right w:w="80" w:type="dxa"/>
+            </w:tcMar>
+          </w:tcPr>
+          <w:p>
+            <w:pPr>
+              <w:jc w:val="left"/>
+              <w:spacing w:before="0" w:after="0"/>
+            </w:pPr>
+            <w:r>
+              <w:rPr>
+                <w:rFonts w:ascii="Calibri" w:hAnsi="Calibri"/>
+                <w:b w:val="0"/>
+                <w:i w:val="0"/>
+                <w:color w:val="881337"/>
+                <w:sz w:val="18"/>
+              </w:rPr>
+              <w:t>Jupiter</w:t>
+            </w:r>
+          </w:p>
+        </w:tc>
+        <w:tc>
+          <w:tcPr>
+            <w:tcW w:w="800" w:type="dxa"/>
+            <w:shd w:val="clear" w:color="auto" w:fill="F8FAFC"/>
+            <w:vAlign w:val="center"/>
+            <w:tcMar>
+              <w:top w:w="60" w:type="dxa"/>
+              <w:bottom w:w="60" w:type="dxa"/>
+              <w:left w:w="40" w:type="dxa"/>
+              <w:right w:w="40" w:type="dxa"/>
+            </w:tcMar>
+          </w:tcPr>
+          <w:p>
+            <w:pPr>
+              <w:jc w:val="center"/>
+              <w:spacing w:before="0" w:after="0"/>
+            </w:pPr>
+          </w:p>
+        </w:tc>
+      </w:tr>
+      <w:tr>
+        <w:tc>
+          <w:tcPr>
+            <w:tcW w:w="400" w:type="dxa"/>
+            <w:shd w:val="clear" w:color="auto" w:fill="F1F5F9"/>
+            <w:vAlign w:val="top"/>
+            <w:tcMar>
+              <w:top w:w="80" w:type="dxa"/>
+              <w:bottom w:w="60" w:type="dxa"/>
+              <w:left w:w="60" w:type="dxa"/>
+              <w:right w:w="60" w:type="dxa"/>
+            </w:tcMar>
+          </w:tcPr>
+          <w:p>
+            <w:pPr>
+              <w:jc w:val="center"/>
+              <w:spacing w:before="0" w:after="0"/>
+            </w:pPr>
+            <w:r>
+              <w:rPr>
+                <w:rFonts w:ascii="Calibri" w:hAnsi="Calibri"/>
+                <w:b/>
+                <w:i w:val="0"/>
+                <w:color w:val="1E3A8A"/>
+                <w:sz w:val="18"/>
+              </w:rPr>
+              <w:t>6</w:t>
+            </w:r>
+          </w:p>
+        </w:tc>
+        <w:tc>
+          <w:tcPr>
+            <w:tcW w:w="3000" w:type="dxa"/>
+            <w:shd w:val="clear" w:color="auto" w:fill="EFF6FF"/>
+            <w:vAlign w:val="top"/>
+            <w:tcMar>
+              <w:top w:w="80" w:type="dxa"/>
+              <w:bottom w:w="60" w:type="dxa"/>
+              <w:left w:w="100" w:type="dxa"/>
+              <w:right w:w="80" w:type="dxa"/>
+            </w:tcMar>
+          </w:tcPr>
+          <w:p>
+            <w:pPr>
+              <w:spacing w:before="0" w:after="0"/>
+            </w:pPr>
+            <w:r>
+              <w:rPr>
+                <w:rFonts w:ascii="Calibri" w:hAnsi="Calibri"/>
+                <w:b w:val="0"/>
+                <w:i w:val="0"/>
+                <w:color w:val="374151"/>
+                <w:sz w:val="19"/>
+              </w:rPr>
+              <w:t>Pernyataan manakah yang BENAR tentang Hukum Newton? (Pilih semua yang benar)</w:t>
+            </w:r>
+          </w:p>
+        </w:tc>
+        <w:tc>
+          <w:tcPr>
+            <w:tcW w:w="900" w:type="dxa"/>
+            <w:shd w:val="clear" w:color="auto" w:fill="C4B5FD"/>
+            <w:vAlign w:val="center"/>
+            <w:tcMar>
+              <w:top w:w="80" w:type="dxa"/>
+              <w:bottom w:w="80" w:type="dxa"/>
+              <w:left w:w="60" w:type="dxa"/>
+              <w:right w:w="60" w:type="dxa"/>
+            </w:tcMar>
+          </w:tcPr>
+          <w:p>
+            <w:pPr>
+              <w:jc w:val="center"/>
+              <w:spacing w:before="0" w:after="0"/>
+            </w:pPr>
+            <w:r>
+              <w:rPr>
+                <w:rFonts w:ascii="Calibri" w:hAnsi="Calibri"/>
+                <w:b/>
+                <w:i w:val="0"/>
+                <w:color w:val="1E3A8A"/>
+                <w:sz w:val="16"/>
+              </w:rPr>
+              <w:t>PG+</w:t>
+            </w:r>
+          </w:p>
+        </w:tc>
+        <w:tc>
+          <w:tcPr>
+            <w:tcW w:w="600" w:type="dxa"/>
+            <w:shd w:val="clear" w:color="auto" w:fill="F8FAFC"/>
+            <w:vAlign w:val="top"/>
+            <w:tcMar>
+              <w:top w:w="60" w:type="dxa"/>
+              <w:bottom w:w="60" w:type="dxa"/>
+              <w:left w:w="100" w:type="dxa"/>
+              <w:right w:w="80" w:type="dxa"/>
+            </w:tcMar>
+          </w:tcPr>
+          <w:p>
+            <w:pPr>
+              <w:jc w:val="left"/>
+              <w:spacing w:before="0" w:after="0"/>
+            </w:pPr>
+          </w:p>
+        </w:tc>
+        <w:tc>
+          <w:tcPr>
+            <w:tcW w:w="4506" w:type="dxa"/>
+            <w:shd w:val="clear" w:color="auto" w:fill="F8FAFC"/>
+            <w:vAlign w:val="top"/>
+            <w:tcMar>
+              <w:top w:w="60" w:type="dxa"/>
+              <w:bottom w:w="60" w:type="dxa"/>
+              <w:left w:w="100" w:type="dxa"/>
+              <w:right w:w="80" w:type="dxa"/>
+            </w:tcMar>
+          </w:tcPr>
+          <w:p>
+            <w:pPr>
+              <w:jc w:val="left"/>
+              <w:spacing w:before="0" w:after="0"/>
+            </w:pPr>
+          </w:p>
+        </w:tc>
+        <w:tc>
+          <w:tcPr>
+            <w:tcW w:w="800" w:type="dxa"/>
+            <w:shd w:val="clear" w:color="auto" w:fill="F8FAFC"/>
+            <w:vAlign w:val="top"/>
+            <w:tcMar>
+              <w:top w:w="60" w:type="dxa"/>
+              <w:bottom w:w="60" w:type="dxa"/>
+              <w:left w:w="100" w:type="dxa"/>
+              <w:right w:w="80" w:type="dxa"/>
+            </w:tcMar>
+          </w:tcPr>
+          <w:p>
+            <w:pPr>
+              <w:jc w:val="left"/>
+              <w:spacing w:before="0" w:after="0"/>
+            </w:pPr>
+          </w:p>
+        </w:tc>
+      </w:tr>
+      <w:tr>
+        <w:tc>
+          <w:tcPr>
+            <w:tcW w:w="400" w:type="dxa"/>
+            <w:shd w:val="clear" w:color="auto" w:fill="F1F5F9"/>
+            <w:vAlign w:val="top"/>
+            <w:tcMar>
+              <w:top w:w="60" w:type="dxa"/>
+              <w:bottom w:w="60" w:type="dxa"/>
+              <w:left w:w="100" w:type="dxa"/>
+              <w:right w:w="80" w:type="dxa"/>
+            </w:tcMar>
+          </w:tcPr>
+          <w:p>
+            <w:pPr>
+              <w:jc w:val="left"/>
+              <w:spacing w:before="0" w:after="0"/>
+            </w:pPr>
+          </w:p>
+        </w:tc>
+        <w:tc>
+          <w:tcPr>
+            <w:tcW w:w="3000" w:type="dxa"/>
+            <w:shd w:val="clear" w:color="auto" w:fill="F8FAFC"/>
+            <w:vAlign w:val="top"/>
+            <w:tcMar>
+              <w:top w:w="60" w:type="dxa"/>
+              <w:bottom w:w="60" w:type="dxa"/>
+              <w:left w:w="100" w:type="dxa"/>
+              <w:right w:w="80" w:type="dxa"/>
+            </w:tcMar>
+          </w:tcPr>
+          <w:p>
+            <w:pPr>
+              <w:jc w:val="left"/>
+              <w:spacing w:before="0" w:after="0"/>
+            </w:pPr>
+          </w:p>
+        </w:tc>
+        <w:tc>
+          <w:tcPr>
+            <w:tcW w:w="900" w:type="dxa"/>
+            <w:shd w:val="clear" w:color="auto" w:fill="DBEAFE"/>
+            <w:vAlign w:val="top"/>
+            <w:tcMar>
+              <w:top w:w="60" w:type="dxa"/>
+              <w:bottom w:w="60" w:type="dxa"/>
+              <w:left w:w="100" w:type="dxa"/>
+              <w:right w:w="80" w:type="dxa"/>
+            </w:tcMar>
+          </w:tcPr>
+          <w:p>
+            <w:pPr>
+              <w:jc w:val="left"/>
+              <w:spacing w:before="0" w:after="0"/>
+            </w:pPr>
+          </w:p>
+        </w:tc>
+        <w:tc>
+          <w:tcPr>
+            <w:tcW w:w="600" w:type="dxa"/>
+            <w:shd w:val="clear" w:color="auto" w:fill="BBF7D0"/>
+            <w:vAlign w:val="center"/>
+            <w:tcMar>
+              <w:top w:w="60" w:type="dxa"/>
+              <w:bottom w:w="60" w:type="dxa"/>
+              <w:left w:w="40" w:type="dxa"/>
+              <w:right w:w="40" w:type="dxa"/>
+            </w:tcMar>
+          </w:tcPr>
+          <w:p>
+            <w:pPr>
+              <w:jc w:val="center"/>
+              <w:spacing w:before="0" w:after="0"/>
+            </w:pPr>
+            <w:r>
+              <w:rPr>
+                <w:rFonts w:ascii="Calibri" w:hAnsi="Calibri"/>
+                <w:b/>
+                <w:i w:val="0"/>
+                <w:color w:val="166534"/>
+                <w:sz w:val="18"/>
+              </w:rPr>
+              <w:t>A</w:t>
+            </w:r>
+          </w:p>
+        </w:tc>
+        <w:tc>
+          <w:tcPr>
+            <w:tcW w:w="4506" w:type="dxa"/>
+            <w:shd w:val="clear" w:color="auto" w:fill="BBF7D0"/>
+            <w:vAlign w:val="top"/>
+            <w:tcMar>
+              <w:top w:w="60" w:type="dxa"/>
+              <w:bottom w:w="60" w:type="dxa"/>
+              <w:left w:w="100" w:type="dxa"/>
+              <w:right w:w="80" w:type="dxa"/>
+            </w:tcMar>
+          </w:tcPr>
+          <w:p>
+            <w:pPr>
+              <w:jc w:val="left"/>
+              <w:spacing w:before="0" w:after="0"/>
+            </w:pPr>
+            <w:r>
+              <w:rPr>
+                <w:rFonts w:ascii="Calibri" w:hAnsi="Calibri"/>
+                <w:b/>
+                <w:i w:val="0"/>
+                <w:color w:val="166534"/>
+                <w:sz w:val="18"/>
+              </w:rPr>
+              <w:t>Hukum I: Benda diam tetap diam jika tidak ada gaya luar</w:t>
+            </w:r>
+          </w:p>
+        </w:tc>
+        <w:tc>
+          <w:tcPr>
+            <w:tcW w:w="800" w:type="dxa"/>
+            <w:shd w:val="clear" w:color="auto" w:fill="BBF7D0"/>
+            <w:vAlign w:val="center"/>
+            <w:tcMar>
+              <w:top w:w="60" w:type="dxa"/>
+              <w:bottom w:w="60" w:type="dxa"/>
+              <w:left w:w="40" w:type="dxa"/>
+              <w:right w:w="40" w:type="dxa"/>
+            </w:tcMar>
+          </w:tcPr>
+          <w:p>
+            <w:pPr>
+              <w:jc w:val="center"/>
+              <w:spacing w:before="0" w:after="0"/>
+            </w:pPr>
+            <w:r>
+              <w:rPr>
+                <w:rFonts w:ascii="Calibri" w:hAnsi="Calibri"/>
+                <w:b/>
+                <w:i w:val="0"/>
+                <w:color w:val="166534"/>
+                <w:sz w:val="20"/>
+              </w:rPr>
+              <w:t>V</w:t>
+            </w:r>
+          </w:p>
+        </w:tc>
+      </w:tr>
+      <w:tr>
+        <w:tc>
+          <w:tcPr>
+            <w:tcW w:w="400" w:type="dxa"/>
+            <w:shd w:val="clear" w:color="auto" w:fill="F1F5F9"/>
+            <w:vAlign w:val="top"/>
+            <w:tcMar>
+              <w:top w:w="60" w:type="dxa"/>
+              <w:bottom w:w="60" w:type="dxa"/>
+              <w:left w:w="100" w:type="dxa"/>
+              <w:right w:w="80" w:type="dxa"/>
+            </w:tcMar>
+          </w:tcPr>
+          <w:p>
+            <w:pPr>
+              <w:jc w:val="left"/>
+              <w:spacing w:before="0" w:after="0"/>
+            </w:pPr>
+          </w:p>
+        </w:tc>
+        <w:tc>
+          <w:tcPr>
+            <w:tcW w:w="3000" w:type="dxa"/>
+            <w:shd w:val="clear" w:color="auto" w:fill="F8FAFC"/>
+            <w:vAlign w:val="top"/>
+            <w:tcMar>
+              <w:top w:w="60" w:type="dxa"/>
+              <w:bottom w:w="60" w:type="dxa"/>
+              <w:left w:w="100" w:type="dxa"/>
+              <w:right w:w="80" w:type="dxa"/>
+            </w:tcMar>
+          </w:tcPr>
+          <w:p>
+            <w:pPr>
+              <w:jc w:val="left"/>
+              <w:spacing w:before="0" w:after="0"/>
+            </w:pPr>
+          </w:p>
+        </w:tc>
+        <w:tc>
+          <w:tcPr>
+            <w:tcW w:w="900" w:type="dxa"/>
+            <w:shd w:val="clear" w:color="auto" w:fill="DCFCE7"/>
+            <w:vAlign w:val="top"/>
+            <w:tcMar>
+              <w:top w:w="60" w:type="dxa"/>
+              <w:bottom w:w="60" w:type="dxa"/>
+              <w:left w:w="100" w:type="dxa"/>
+              <w:right w:w="80" w:type="dxa"/>
+            </w:tcMar>
+          </w:tcPr>
+          <w:p>
+            <w:pPr>
+              <w:jc w:val="left"/>
+              <w:spacing w:before="0" w:after="0"/>
+            </w:pPr>
+          </w:p>
+        </w:tc>
+        <w:tc>
+          <w:tcPr>
+            <w:tcW w:w="600" w:type="dxa"/>
+            <w:shd w:val="clear" w:color="auto" w:fill="BBF7D0"/>
+            <w:vAlign w:val="center"/>
+            <w:tcMar>
+              <w:top w:w="60" w:type="dxa"/>
+              <w:bottom w:w="60" w:type="dxa"/>
+              <w:left w:w="40" w:type="dxa"/>
+              <w:right w:w="40" w:type="dxa"/>
+            </w:tcMar>
+          </w:tcPr>
+          <w:p>
+            <w:pPr>
+              <w:jc w:val="center"/>
+              <w:spacing w:before="0" w:after="0"/>
+            </w:pPr>
+            <w:r>
+              <w:rPr>
+                <w:rFonts w:ascii="Calibri" w:hAnsi="Calibri"/>
+                <w:b/>
+                <w:i w:val="0"/>
+                <w:color w:val="166534"/>
+                <w:sz w:val="18"/>
+              </w:rPr>
+              <w:t>B</w:t>
+            </w:r>
+          </w:p>
+        </w:tc>
+        <w:tc>
+          <w:tcPr>
+            <w:tcW w:w="4506" w:type="dxa"/>
+            <w:shd w:val="clear" w:color="auto" w:fill="BBF7D0"/>
+            <w:vAlign w:val="top"/>
+            <w:tcMar>
+              <w:top w:w="60" w:type="dxa"/>
+              <w:bottom w:w="60" w:type="dxa"/>
+              <w:left w:w="100" w:type="dxa"/>
+              <w:right w:w="80" w:type="dxa"/>
+            </w:tcMar>
+          </w:tcPr>
+          <w:p>
+            <w:pPr>
+              <w:jc w:val="left"/>
+              <w:spacing w:before="0" w:after="0"/>
+            </w:pPr>
+            <w:r>
+              <w:rPr>
+                <w:rFonts w:ascii="Calibri" w:hAnsi="Calibri"/>
+                <w:b/>
+                <w:i w:val="0"/>
+                <w:color w:val="166534"/>
+                <w:sz w:val="18"/>
+              </w:rPr>
+              <w:t>Hukum II: F = m x a</w:t>
+            </w:r>
+          </w:p>
+        </w:tc>
+        <w:tc>
+          <w:tcPr>
+            <w:tcW w:w="800" w:type="dxa"/>
+            <w:shd w:val="clear" w:color="auto" w:fill="BBF7D0"/>
+            <w:vAlign w:val="center"/>
+            <w:tcMar>
+              <w:top w:w="60" w:type="dxa"/>
+              <w:bottom w:w="60" w:type="dxa"/>
+              <w:left w:w="40" w:type="dxa"/>
+              <w:right w:w="40" w:type="dxa"/>
+            </w:tcMar>
+          </w:tcPr>
+          <w:p>
+            <w:pPr>
+              <w:jc w:val="center"/>
+              <w:spacing w:before="0" w:after="0"/>
+            </w:pPr>
+            <w:r>
+              <w:rPr>
+                <w:rFonts w:ascii="Calibri" w:hAnsi="Calibri"/>
+                <w:b/>
+                <w:i w:val="0"/>
+                <w:color w:val="166534"/>
+                <w:sz w:val="20"/>
+              </w:rPr>
+              <w:t>V</w:t>
+            </w:r>
+          </w:p>
+        </w:tc>
+      </w:tr>
+      <w:tr>
+        <w:tc>
+          <w:tcPr>
+            <w:tcW w:w="400" w:type="dxa"/>
+            <w:shd w:val="clear" w:color="auto" w:fill="F1F5F9"/>
+            <w:vAlign w:val="top"/>
+            <w:tcMar>
+              <w:top w:w="60" w:type="dxa"/>
+              <w:bottom w:w="60" w:type="dxa"/>
+              <w:left w:w="100" w:type="dxa"/>
+              <w:right w:w="80" w:type="dxa"/>
+            </w:tcMar>
+          </w:tcPr>
+          <w:p>
+            <w:pPr>
+              <w:jc w:val="left"/>
+              <w:spacing w:before="0" w:after="0"/>
+            </w:pPr>
+          </w:p>
+        </w:tc>
+        <w:tc>
+          <w:tcPr>
+            <w:tcW w:w="3000" w:type="dxa"/>
+            <w:shd w:val="clear" w:color="auto" w:fill="F8FAFC"/>
+            <w:vAlign w:val="top"/>
+            <w:tcMar>
+              <w:top w:w="60" w:type="dxa"/>
+              <w:bottom w:w="60" w:type="dxa"/>
+              <w:left w:w="100" w:type="dxa"/>
+              <w:right w:w="80" w:type="dxa"/>
+            </w:tcMar>
+          </w:tcPr>
+          <w:p>
+            <w:pPr>
+              <w:jc w:val="left"/>
+              <w:spacing w:before="0" w:after="0"/>
+            </w:pPr>
+          </w:p>
+        </w:tc>
+        <w:tc>
+          <w:tcPr>
+            <w:tcW w:w="900" w:type="dxa"/>
+            <w:shd w:val="clear" w:color="auto" w:fill="FEF9C3"/>
+            <w:vAlign w:val="top"/>
+            <w:tcMar>
+              <w:top w:w="60" w:type="dxa"/>
+              <w:bottom w:w="60" w:type="dxa"/>
+              <w:left w:w="100" w:type="dxa"/>
+              <w:right w:w="80" w:type="dxa"/>
+            </w:tcMar>
+          </w:tcPr>
+          <w:p>
+            <w:pPr>
+              <w:jc w:val="left"/>
+              <w:spacing w:before="0" w:after="0"/>
+            </w:pPr>
+          </w:p>
+        </w:tc>
+        <w:tc>
+          <w:tcPr>
+            <w:tcW w:w="600" w:type="dxa"/>
+            <w:shd w:val="clear" w:color="auto" w:fill="FEF9C3"/>
+            <w:vAlign w:val="center"/>
+            <w:tcMar>
+              <w:top w:w="60" w:type="dxa"/>
+              <w:bottom w:w="60" w:type="dxa"/>
+              <w:left w:w="40" w:type="dxa"/>
+              <w:right w:w="40" w:type="dxa"/>
+            </w:tcMar>
+          </w:tcPr>
+          <w:p>
+            <w:pPr>
+              <w:jc w:val="center"/>
+              <w:spacing w:before="0" w:after="0"/>
+            </w:pPr>
+            <w:r>
+              <w:rPr>
+                <w:rFonts w:ascii="Calibri" w:hAnsi="Calibri"/>
+                <w:b/>
+                <w:i w:val="0"/>
+                <w:color w:val="713F12"/>
+                <w:sz w:val="18"/>
+              </w:rPr>
+              <w:t>C</w:t>
+            </w:r>
+          </w:p>
+        </w:tc>
+        <w:tc>
+          <w:tcPr>
+            <w:tcW w:w="4506" w:type="dxa"/>
+            <w:shd w:val="clear" w:color="auto" w:fill="FEF9C3"/>
+            <w:vAlign w:val="top"/>
+            <w:tcMar>
+              <w:top w:w="60" w:type="dxa"/>
+              <w:bottom w:w="60" w:type="dxa"/>
+              <w:left w:w="100" w:type="dxa"/>
+              <w:right w:w="80" w:type="dxa"/>
+            </w:tcMar>
+          </w:tcPr>
+          <w:p>
+            <w:pPr>
+              <w:jc w:val="left"/>
+              <w:spacing w:before="0" w:after="0"/>
+            </w:pPr>
+            <w:r>
+              <w:rPr>
+                <w:rFonts w:ascii="Calibri" w:hAnsi="Calibri"/>
+                <w:b w:val="0"/>
+                <w:i w:val="0"/>
+                <w:color w:val="713F12"/>
+                <w:sz w:val="18"/>
+              </w:rPr>
+              <w:t>Hukum III: Aksi = Reaksi dengan arah yang SAMA</w:t>
+            </w:r>
+          </w:p>
+        </w:tc>
+        <w:tc>
+          <w:tcPr>
+            <w:tcW w:w="800" w:type="dxa"/>
+            <w:shd w:val="clear" w:color="auto" w:fill="F8FAFC"/>
+            <w:vAlign w:val="center"/>
+            <w:tcMar>
+              <w:top w:w="60" w:type="dxa"/>
+              <w:bottom w:w="60" w:type="dxa"/>
+              <w:left w:w="40" w:type="dxa"/>
+              <w:right w:w="40" w:type="dxa"/>
+            </w:tcMar>
+          </w:tcPr>
+          <w:p>
+            <w:pPr>
+              <w:jc w:val="center"/>
+              <w:spacing w:before="0" w:after="0"/>
+            </w:pPr>
+          </w:p>
+        </w:tc>
+      </w:tr>
+      <w:tr>
+        <w:tc>
+          <w:tcPr>
+            <w:tcW w:w="400" w:type="dxa"/>
+            <w:shd w:val="clear" w:color="auto" w:fill="F1F5F9"/>
+            <w:vAlign w:val="top"/>
+            <w:tcMar>
+              <w:top w:w="60" w:type="dxa"/>
+              <w:bottom w:w="60" w:type="dxa"/>
+              <w:left w:w="100" w:type="dxa"/>
+              <w:right w:w="80" w:type="dxa"/>
+            </w:tcMar>
+          </w:tcPr>
+          <w:p>
+            <w:pPr>
+              <w:jc w:val="left"/>
+              <w:spacing w:before="0" w:after="0"/>
+            </w:pPr>
+          </w:p>
+        </w:tc>
+        <w:tc>
+          <w:tcPr>
+            <w:tcW w:w="3000" w:type="dxa"/>
+            <w:shd w:val="clear" w:color="auto" w:fill="F8FAFC"/>
+            <w:vAlign w:val="top"/>
+            <w:tcMar>
+              <w:top w:w="60" w:type="dxa"/>
+              <w:bottom w:w="60" w:type="dxa"/>
+              <w:left w:w="100" w:type="dxa"/>
+              <w:right w:w="80" w:type="dxa"/>
+            </w:tcMar>
+          </w:tcPr>
+          <w:p>
+            <w:pPr>
+              <w:jc w:val="left"/>
+              <w:spacing w:before="0" w:after="0"/>
+            </w:pPr>
+          </w:p>
+        </w:tc>
+        <w:tc>
+          <w:tcPr>
+            <w:tcW w:w="900" w:type="dxa"/>
+            <w:shd w:val="clear" w:color="auto" w:fill="F3E8FF"/>
+            <w:vAlign w:val="top"/>
+            <w:tcMar>
+              <w:top w:w="60" w:type="dxa"/>
+              <w:bottom w:w="60" w:type="dxa"/>
+              <w:left w:w="100" w:type="dxa"/>
+              <w:right w:w="80" w:type="dxa"/>
+            </w:tcMar>
+          </w:tcPr>
+          <w:p>
+            <w:pPr>
+              <w:jc w:val="left"/>
+              <w:spacing w:before="0" w:after="0"/>
+            </w:pPr>
+          </w:p>
+        </w:tc>
+        <w:tc>
+          <w:tcPr>
+            <w:tcW w:w="600" w:type="dxa"/>
+            <w:shd w:val="clear" w:color="auto" w:fill="F3E8FF"/>
+            <w:vAlign w:val="center"/>
+            <w:tcMar>
+              <w:top w:w="60" w:type="dxa"/>
+              <w:bottom w:w="60" w:type="dxa"/>
+              <w:left w:w="40" w:type="dxa"/>
+              <w:right w:w="40" w:type="dxa"/>
+            </w:tcMar>
+          </w:tcPr>
+          <w:p>
+            <w:pPr>
+              <w:jc w:val="center"/>
+              <w:spacing w:before="0" w:after="0"/>
+            </w:pPr>
+            <w:r>
+              <w:rPr>
+                <w:rFonts w:ascii="Calibri" w:hAnsi="Calibri"/>
+                <w:b/>
+                <w:i w:val="0"/>
+                <w:color w:val="581C87"/>
+                <w:sz w:val="18"/>
+              </w:rPr>
+              <w:t>D</w:t>
+            </w:r>
+          </w:p>
+        </w:tc>
+        <w:tc>
+          <w:tcPr>
+            <w:tcW w:w="4506" w:type="dxa"/>
+            <w:shd w:val="clear" w:color="auto" w:fill="F3E8FF"/>
+            <w:vAlign w:val="top"/>
+            <w:tcMar>
+              <w:top w:w="60" w:type="dxa"/>
+              <w:bottom w:w="60" w:type="dxa"/>
+              <w:left w:w="100" w:type="dxa"/>
+              <w:right w:w="80" w:type="dxa"/>
+            </w:tcMar>
+          </w:tcPr>
+          <w:p>
+            <w:pPr>
+              <w:jc w:val="left"/>
+              <w:spacing w:before="0" w:after="0"/>
+            </w:pPr>
+            <w:r>
+              <w:rPr>
+                <w:rFonts w:ascii="Calibri" w:hAnsi="Calibri"/>
+                <w:b w:val="0"/>
+                <w:i w:val="0"/>
+                <w:color w:val="581C87"/>
+                <w:sz w:val="18"/>
+              </w:rPr>
+              <w:t>Hukum II: F = m / a</w:t>
+            </w:r>
+          </w:p>
+        </w:tc>
+        <w:tc>
+          <w:tcPr>
+            <w:tcW w:w="800" w:type="dxa"/>
+            <w:shd w:val="clear" w:color="auto" w:fill="F8FAFC"/>
+            <w:vAlign w:val="center"/>
+            <w:tcMar>
+              <w:top w:w="60" w:type="dxa"/>
+              <w:bottom w:w="60" w:type="dxa"/>
+              <w:left w:w="40" w:type="dxa"/>
+              <w:right w:w="40" w:type="dxa"/>
+            </w:tcMar>
+          </w:tcPr>
+          <w:p>
+            <w:pPr>
+              <w:jc w:val="center"/>
+              <w:spacing w:before="0" w:after="0"/>
+            </w:pPr>
+          </w:p>
+        </w:tc>
+      </w:tr>
+      <w:tr>
+        <w:tc>
+          <w:tcPr>
+            <w:tcW w:w="400" w:type="dxa"/>
+            <w:shd w:val="clear" w:color="auto" w:fill="F1F5F9"/>
+            <w:vAlign w:val="top"/>
+            <w:tcMar>
+              <w:top w:w="60" w:type="dxa"/>
+              <w:bottom w:w="60" w:type="dxa"/>
+              <w:left w:w="100" w:type="dxa"/>
+              <w:right w:w="80" w:type="dxa"/>
+            </w:tcMar>
+          </w:tcPr>
+          <w:p>
+            <w:pPr>
+              <w:jc w:val="left"/>
+              <w:spacing w:before="0" w:after="0"/>
+            </w:pPr>
+          </w:p>
+        </w:tc>
+        <w:tc>
+          <w:tcPr>
+            <w:tcW w:w="3000" w:type="dxa"/>
+            <w:shd w:val="clear" w:color="auto" w:fill="F8FAFC"/>
+            <w:vAlign w:val="top"/>
+            <w:tcMar>
+              <w:top w:w="60" w:type="dxa"/>
+              <w:bottom w:w="60" w:type="dxa"/>
+              <w:left w:w="100" w:type="dxa"/>
+              <w:right w:w="80" w:type="dxa"/>
+            </w:tcMar>
+          </w:tcPr>
+          <w:p>
+            <w:pPr>
+              <w:jc w:val="left"/>
+              <w:spacing w:before="0" w:after="0"/>
+            </w:pPr>
+          </w:p>
+        </w:tc>
+        <w:tc>
+          <w:tcPr>
+            <w:tcW w:w="900" w:type="dxa"/>
+            <w:shd w:val="clear" w:color="auto" w:fill="FFE4E6"/>
+            <w:vAlign w:val="top"/>
+            <w:tcMar>
+              <w:top w:w="60" w:type="dxa"/>
+              <w:bottom w:w="60" w:type="dxa"/>
+              <w:left w:w="100" w:type="dxa"/>
+              <w:right w:w="80" w:type="dxa"/>
+            </w:tcMar>
+          </w:tcPr>
+          <w:p>
+            <w:pPr>
+              <w:jc w:val="left"/>
+              <w:spacing w:before="0" w:after="0"/>
+            </w:pPr>
+          </w:p>
+        </w:tc>
+        <w:tc>
+          <w:tcPr>
+            <w:tcW w:w="600" w:type="dxa"/>
+            <w:shd w:val="clear" w:color="auto" w:fill="BBF7D0"/>
+            <w:vAlign w:val="center"/>
+            <w:tcMar>
+              <w:top w:w="60" w:type="dxa"/>
+              <w:bottom w:w="60" w:type="dxa"/>
+              <w:left w:w="40" w:type="dxa"/>
+              <w:right w:w="40" w:type="dxa"/>
+            </w:tcMar>
+          </w:tcPr>
+          <w:p>
+            <w:pPr>
+              <w:jc w:val="center"/>
+              <w:spacing w:before="0" w:after="0"/>
+            </w:pPr>
+            <w:r>
+              <w:rPr>
+                <w:rFonts w:ascii="Calibri" w:hAnsi="Calibri"/>
+                <w:b/>
+                <w:i w:val="0"/>
+                <w:color w:val="166534"/>
+                <w:sz w:val="18"/>
+              </w:rPr>
+              <w:t>E</w:t>
+            </w:r>
+          </w:p>
+        </w:tc>
+        <w:tc>
+          <w:tcPr>
+            <w:tcW w:w="4506" w:type="dxa"/>
+            <w:shd w:val="clear" w:color="auto" w:fill="BBF7D0"/>
+            <w:vAlign w:val="top"/>
+            <w:tcMar>
+              <w:top w:w="60" w:type="dxa"/>
+              <w:bottom w:w="60" w:type="dxa"/>
+              <w:left w:w="100" w:type="dxa"/>
+              <w:right w:w="80" w:type="dxa"/>
+            </w:tcMar>
+          </w:tcPr>
+          <w:p>
+            <w:pPr>
+              <w:jc w:val="left"/>
+              <w:spacing w:before="0" w:after="0"/>
+            </w:pPr>
+            <w:r>
+              <w:rPr>
+                <w:rFonts w:ascii="Calibri" w:hAnsi="Calibri"/>
+                <w:b/>
+                <w:i w:val="0"/>
+                <w:color w:val="166534"/>
+                <w:sz w:val="18"/>
+              </w:rPr>
+              <w:t>Hukum I disebut Hukum Kelembaman</w:t>
+            </w:r>
+          </w:p>
+        </w:tc>
+        <w:tc>
+          <w:tcPr>
+            <w:tcW w:w="800" w:type="dxa"/>
+            <w:shd w:val="clear" w:color="auto" w:fill="BBF7D0"/>
+            <w:vAlign w:val="center"/>
+            <w:tcMar>
+              <w:top w:w="60" w:type="dxa"/>
+              <w:bottom w:w="60" w:type="dxa"/>
+              <w:left w:w="40" w:type="dxa"/>
+              <w:right w:w="40" w:type="dxa"/>
+            </w:tcMar>
+          </w:tcPr>
+          <w:p>
+            <w:pPr>
+              <w:jc w:val="center"/>
+              <w:spacing w:before="0" w:after="0"/>
+            </w:pPr>
+            <w:r>
+              <w:rPr>
+                <w:rFonts w:ascii="Calibri" w:hAnsi="Calibri"/>
+                <w:b/>
+                <w:i w:val="0"/>
+                <w:color w:val="166534"/>
+                <w:sz w:val="20"/>
+              </w:rPr>
+              <w:t>V</w:t>
+            </w:r>
+          </w:p>
+        </w:tc>
+      </w:tr>
+      <w:tr>
+        <w:tc>
+          <w:tcPr>
             <w:tcW w:w="10206" w:type="dxa"/>
             <w:gridSpan w:val="6"/>
             <w:shd w:val="clear" w:color="auto" w:fill="1E3A8A"/>
@@ -3057,7 +5700,7 @@
                 <w:color w:val="1E3A8A"/>
                 <w:sz w:val="18"/>
               </w:rPr>
-              <w:t>4</w:t>
+              <w:t>7</w:t>
             </w:r>
           </w:p>
         </w:tc>
@@ -3231,7 +5874,7 @@
                 <w:color w:val="1E3A8A"/>
                 <w:sz w:val="18"/>
               </w:rPr>
-              <w:t>5</w:t>
+              <w:t>8</w:t>
             </w:r>
           </w:p>
         </w:tc>
@@ -3395,7 +6038,7 @@
                 <w:color w:val="1E3A8A"/>
                 <w:sz w:val="18"/>
               </w:rPr>
-              <w:t>6</w:t>
+              <w:t>9</w:t>
             </w:r>
           </w:p>
         </w:tc>
@@ -3422,7 +6065,7 @@
                 <w:i w:val="0"/>
                 <w:sz w:val="19"/>
               </w:rPr>
-              <w:t>Air mendidih pada suhu 100°C pada tekanan normal.</w:t>
+              <w:t>Air mendidih pada suhu 100°C pada tekanan normal di permukaan laut.</w:t>
             </w:r>
           </w:p>
         </w:tc>
@@ -3569,7 +6212,7 @@
                 <w:color w:val="FFFFFF"/>
                 <w:sz w:val="18"/>
               </w:rPr>
-              <w:t xml:space="preserve">  4 — MENJODOHKAN  |  Kolom KUNCI diisi huruf pasangan yang sesuai (A, B, C, ...)</w:t>
+              <w:t xml:space="preserve">  4 — MENJODOHKAN  |  Kolom JAWABAN = item kiri, Kolom KUNCI = pasangan kanan yang sesuai</w:t>
             </w:r>
           </w:p>
         </w:tc>
@@ -3600,7 +6243,7 @@
                 <w:color w:val="1E3A8A"/>
                 <w:sz w:val="18"/>
               </w:rPr>
-              <w:t>7</w:t>
+              <w:t>10</w:t>
             </w:r>
           </w:p>
         </w:tc>
@@ -4237,6 +6880,1488 @@
       <w:tr>
         <w:tc>
           <w:tcPr>
+            <w:tcW w:w="400" w:type="dxa"/>
+            <w:shd w:val="clear" w:color="auto" w:fill="F1F5F9"/>
+            <w:vAlign w:val="top"/>
+            <w:tcMar>
+              <w:top w:w="80" w:type="dxa"/>
+              <w:bottom w:w="60" w:type="dxa"/>
+              <w:left w:w="60" w:type="dxa"/>
+              <w:right w:w="60" w:type="dxa"/>
+            </w:tcMar>
+          </w:tcPr>
+          <w:p>
+            <w:pPr>
+              <w:jc w:val="center"/>
+              <w:spacing w:before="0" w:after="0"/>
+            </w:pPr>
+            <w:r>
+              <w:rPr>
+                <w:rFonts w:ascii="Calibri" w:hAnsi="Calibri"/>
+                <w:b/>
+                <w:i w:val="0"/>
+                <w:color w:val="1E3A8A"/>
+                <w:sz w:val="18"/>
+              </w:rPr>
+              <w:t>11</w:t>
+            </w:r>
+          </w:p>
+        </w:tc>
+        <w:tc>
+          <w:tcPr>
+            <w:tcW w:w="3000" w:type="dxa"/>
+            <w:shd w:val="clear" w:color="auto" w:fill="EFF6FF"/>
+            <w:vAlign w:val="top"/>
+            <w:tcMar>
+              <w:top w:w="60" w:type="dxa"/>
+              <w:bottom w:w="60" w:type="dxa"/>
+              <w:left w:w="100" w:type="dxa"/>
+              <w:right w:w="80" w:type="dxa"/>
+            </w:tcMar>
+          </w:tcPr>
+          <w:p>
+            <w:pPr>
+              <w:spacing w:before="0" w:after="0"/>
+            </w:pPr>
+            <w:r>
+              <w:rPr>
+                <w:rFonts w:ascii="Calibri" w:hAnsi="Calibri"/>
+                <w:b w:val="0"/>
+                <w:i w:val="0"/>
+                <w:sz w:val="19"/>
+              </w:rPr>
+              <w:t>F = m x a</w:t>
+            </w:r>
+          </w:p>
+        </w:tc>
+        <w:tc>
+          <w:tcPr>
+            <w:tcW w:w="900" w:type="dxa"/>
+            <w:shd w:val="clear" w:color="auto" w:fill="E0F2FE"/>
+            <w:vAlign w:val="center"/>
+            <w:tcMar>
+              <w:top w:w="60" w:type="dxa"/>
+              <w:bottom w:w="60" w:type="dxa"/>
+              <w:left w:w="60" w:type="dxa"/>
+              <w:right w:w="60" w:type="dxa"/>
+            </w:tcMar>
+          </w:tcPr>
+          <w:p>
+            <w:pPr>
+              <w:jc w:val="center"/>
+              <w:spacing w:before="0" w:after="0"/>
+            </w:pPr>
+            <w:r>
+              <w:rPr>
+                <w:rFonts w:ascii="Calibri" w:hAnsi="Calibri"/>
+                <w:b/>
+                <w:i w:val="0"/>
+                <w:color w:val="1E3A8A"/>
+                <w:sz w:val="16"/>
+              </w:rPr>
+              <w:t>JODOH</w:t>
+            </w:r>
+          </w:p>
+        </w:tc>
+        <w:tc>
+          <w:tcPr>
+            <w:tcW w:w="600" w:type="dxa"/>
+            <w:shd w:val="clear" w:color="auto" w:fill="DBEAFE"/>
+            <w:vAlign w:val="center"/>
+            <w:tcMar>
+              <w:top w:w="60" w:type="dxa"/>
+              <w:bottom w:w="60" w:type="dxa"/>
+              <w:left w:w="40" w:type="dxa"/>
+              <w:right w:w="40" w:type="dxa"/>
+            </w:tcMar>
+          </w:tcPr>
+          <w:p>
+            <w:pPr>
+              <w:jc w:val="center"/>
+              <w:spacing w:before="0" w:after="0"/>
+            </w:pPr>
+            <w:r>
+              <w:rPr>
+                <w:rFonts w:ascii="Calibri" w:hAnsi="Calibri"/>
+                <w:b/>
+                <w:i w:val="0"/>
+                <w:color w:val="1E3A8A"/>
+                <w:sz w:val="18"/>
+              </w:rPr>
+              <w:t>A</w:t>
+            </w:r>
+          </w:p>
+        </w:tc>
+        <w:tc>
+          <w:tcPr>
+            <w:tcW w:w="4506" w:type="dxa"/>
+            <w:shd w:val="clear" w:color="auto" w:fill="DBEAFE"/>
+            <w:vAlign w:val="top"/>
+            <w:tcMar>
+              <w:top w:w="60" w:type="dxa"/>
+              <w:bottom w:w="60" w:type="dxa"/>
+              <w:left w:w="100" w:type="dxa"/>
+              <w:right w:w="80" w:type="dxa"/>
+            </w:tcMar>
+          </w:tcPr>
+          <w:p>
+            <w:pPr>
+              <w:jc w:val="left"/>
+              <w:spacing w:before="0" w:after="0"/>
+            </w:pPr>
+            <w:r>
+              <w:rPr>
+                <w:rFonts w:ascii="Calibri" w:hAnsi="Calibri"/>
+                <w:b w:val="0"/>
+                <w:i w:val="0"/>
+                <w:color w:val="1E3A8A"/>
+                <w:sz w:val="18"/>
+              </w:rPr>
+              <w:t>Hukum Newton II</w:t>
+            </w:r>
+          </w:p>
+        </w:tc>
+        <w:tc>
+          <w:tcPr>
+            <w:tcW w:w="800" w:type="dxa"/>
+            <w:shd w:val="clear" w:color="auto" w:fill="BBF7D0"/>
+            <w:vAlign w:val="center"/>
+            <w:tcMar>
+              <w:top w:w="60" w:type="dxa"/>
+              <w:bottom w:w="60" w:type="dxa"/>
+              <w:left w:w="40" w:type="dxa"/>
+              <w:right w:w="40" w:type="dxa"/>
+            </w:tcMar>
+          </w:tcPr>
+          <w:p>
+            <w:pPr>
+              <w:jc w:val="center"/>
+              <w:spacing w:before="0" w:after="0"/>
+            </w:pPr>
+            <w:r>
+              <w:rPr>
+                <w:rFonts w:ascii="Calibri" w:hAnsi="Calibri"/>
+                <w:b/>
+                <w:i w:val="0"/>
+                <w:color w:val="166534"/>
+                <w:sz w:val="18"/>
+              </w:rPr>
+              <w:t>A</w:t>
+            </w:r>
+          </w:p>
+        </w:tc>
+      </w:tr>
+      <w:tr>
+        <w:tc>
+          <w:tcPr>
+            <w:tcW w:w="400" w:type="dxa"/>
+            <w:shd w:val="clear" w:color="auto" w:fill="F1F5F9"/>
+            <w:vAlign w:val="top"/>
+            <w:tcMar>
+              <w:top w:w="80" w:type="dxa"/>
+              <w:bottom w:w="60" w:type="dxa"/>
+              <w:left w:w="60" w:type="dxa"/>
+              <w:right w:w="60" w:type="dxa"/>
+            </w:tcMar>
+          </w:tcPr>
+          <w:p>
+            <w:pPr>
+              <w:jc w:val="center"/>
+              <w:spacing w:before="0" w:after="0"/>
+            </w:pPr>
+          </w:p>
+        </w:tc>
+        <w:tc>
+          <w:tcPr>
+            <w:tcW w:w="3000" w:type="dxa"/>
+            <w:shd w:val="clear" w:color="auto" w:fill="EFF6FF"/>
+            <w:vAlign w:val="top"/>
+            <w:tcMar>
+              <w:top w:w="60" w:type="dxa"/>
+              <w:bottom w:w="60" w:type="dxa"/>
+              <w:left w:w="100" w:type="dxa"/>
+              <w:right w:w="80" w:type="dxa"/>
+            </w:tcMar>
+          </w:tcPr>
+          <w:p>
+            <w:pPr>
+              <w:spacing w:before="0" w:after="0"/>
+            </w:pPr>
+            <w:r>
+              <w:rPr>
+                <w:rFonts w:ascii="Calibri" w:hAnsi="Calibri"/>
+                <w:b w:val="0"/>
+                <w:i w:val="0"/>
+                <w:sz w:val="19"/>
+              </w:rPr>
+            </w:r>
+          </w:p>
+        </w:tc>
+        <w:tc>
+          <w:tcPr>
+            <w:tcW w:w="900" w:type="dxa"/>
+            <w:shd w:val="clear" w:color="auto" w:fill="E0F2FE"/>
+            <w:vAlign w:val="center"/>
+            <w:tcMar>
+              <w:top w:w="60" w:type="dxa"/>
+              <w:bottom w:w="60" w:type="dxa"/>
+              <w:left w:w="60" w:type="dxa"/>
+              <w:right w:w="60" w:type="dxa"/>
+            </w:tcMar>
+          </w:tcPr>
+          <w:p>
+            <w:pPr>
+              <w:jc w:val="center"/>
+              <w:spacing w:before="0" w:after="0"/>
+            </w:pPr>
+            <w:r>
+              <w:rPr>
+                <w:rFonts w:ascii="Calibri" w:hAnsi="Calibri"/>
+                <w:b/>
+                <w:i w:val="0"/>
+                <w:color w:val="1E3A8A"/>
+                <w:sz w:val="16"/>
+              </w:rPr>
+            </w:r>
+          </w:p>
+        </w:tc>
+        <w:tc>
+          <w:tcPr>
+            <w:tcW w:w="600" w:type="dxa"/>
+            <w:shd w:val="clear" w:color="auto" w:fill="DCFCE7"/>
+            <w:vAlign w:val="center"/>
+            <w:tcMar>
+              <w:top w:w="60" w:type="dxa"/>
+              <w:bottom w:w="60" w:type="dxa"/>
+              <w:left w:w="40" w:type="dxa"/>
+              <w:right w:w="40" w:type="dxa"/>
+            </w:tcMar>
+          </w:tcPr>
+          <w:p>
+            <w:pPr>
+              <w:jc w:val="center"/>
+              <w:spacing w:before="0" w:after="0"/>
+            </w:pPr>
+            <w:r>
+              <w:rPr>
+                <w:rFonts w:ascii="Calibri" w:hAnsi="Calibri"/>
+                <w:b/>
+                <w:i w:val="0"/>
+                <w:color w:val="14532D"/>
+                <w:sz w:val="18"/>
+              </w:rPr>
+              <w:t>B</w:t>
+            </w:r>
+          </w:p>
+        </w:tc>
+        <w:tc>
+          <w:tcPr>
+            <w:tcW w:w="4506" w:type="dxa"/>
+            <w:shd w:val="clear" w:color="auto" w:fill="DCFCE7"/>
+            <w:vAlign w:val="top"/>
+            <w:tcMar>
+              <w:top w:w="60" w:type="dxa"/>
+              <w:bottom w:w="60" w:type="dxa"/>
+              <w:left w:w="100" w:type="dxa"/>
+              <w:right w:w="80" w:type="dxa"/>
+            </w:tcMar>
+          </w:tcPr>
+          <w:p>
+            <w:pPr>
+              <w:jc w:val="left"/>
+              <w:spacing w:before="0" w:after="0"/>
+            </w:pPr>
+            <w:r>
+              <w:rPr>
+                <w:rFonts w:ascii="Calibri" w:hAnsi="Calibri"/>
+                <w:b w:val="0"/>
+                <w:i w:val="0"/>
+                <w:color w:val="14532D"/>
+                <w:sz w:val="18"/>
+              </w:rPr>
+              <w:t>Teori Relativitas Einstein</w:t>
+            </w:r>
+          </w:p>
+        </w:tc>
+        <w:tc>
+          <w:tcPr>
+            <w:tcW w:w="800" w:type="dxa"/>
+            <w:shd w:val="clear" w:color="auto" w:fill="BBF7D0"/>
+            <w:vAlign w:val="center"/>
+            <w:tcMar>
+              <w:top w:w="60" w:type="dxa"/>
+              <w:bottom w:w="60" w:type="dxa"/>
+              <w:left w:w="40" w:type="dxa"/>
+              <w:right w:w="40" w:type="dxa"/>
+            </w:tcMar>
+          </w:tcPr>
+          <w:p>
+            <w:pPr>
+              <w:jc w:val="center"/>
+              <w:spacing w:before="0" w:after="0"/>
+            </w:pPr>
+            <w:r>
+              <w:rPr>
+                <w:rFonts w:ascii="Calibri" w:hAnsi="Calibri"/>
+                <w:b/>
+                <w:i w:val="0"/>
+                <w:color w:val="166534"/>
+                <w:sz w:val="18"/>
+              </w:rPr>
+              <w:t>B</w:t>
+            </w:r>
+          </w:p>
+        </w:tc>
+      </w:tr>
+      <w:tr>
+        <w:tc>
+          <w:tcPr>
+            <w:tcW w:w="400" w:type="dxa"/>
+            <w:shd w:val="clear" w:color="auto" w:fill="F1F5F9"/>
+            <w:vAlign w:val="top"/>
+            <w:tcMar>
+              <w:top w:w="80" w:type="dxa"/>
+              <w:bottom w:w="60" w:type="dxa"/>
+              <w:left w:w="60" w:type="dxa"/>
+              <w:right w:w="60" w:type="dxa"/>
+            </w:tcMar>
+          </w:tcPr>
+          <w:p>
+            <w:pPr>
+              <w:jc w:val="center"/>
+              <w:spacing w:before="0" w:after="0"/>
+            </w:pPr>
+          </w:p>
+        </w:tc>
+        <w:tc>
+          <w:tcPr>
+            <w:tcW w:w="3000" w:type="dxa"/>
+            <w:shd w:val="clear" w:color="auto" w:fill="EFF6FF"/>
+            <w:vAlign w:val="top"/>
+            <w:tcMar>
+              <w:top w:w="60" w:type="dxa"/>
+              <w:bottom w:w="60" w:type="dxa"/>
+              <w:left w:w="100" w:type="dxa"/>
+              <w:right w:w="80" w:type="dxa"/>
+            </w:tcMar>
+          </w:tcPr>
+          <w:p>
+            <w:pPr>
+              <w:spacing w:before="0" w:after="0"/>
+            </w:pPr>
+            <w:r>
+              <w:rPr>
+                <w:rFonts w:ascii="Calibri" w:hAnsi="Calibri"/>
+                <w:b w:val="0"/>
+                <w:i w:val="0"/>
+                <w:sz w:val="19"/>
+              </w:rPr>
+            </w:r>
+          </w:p>
+        </w:tc>
+        <w:tc>
+          <w:tcPr>
+            <w:tcW w:w="900" w:type="dxa"/>
+            <w:shd w:val="clear" w:color="auto" w:fill="E0F2FE"/>
+            <w:vAlign w:val="center"/>
+            <w:tcMar>
+              <w:top w:w="60" w:type="dxa"/>
+              <w:bottom w:w="60" w:type="dxa"/>
+              <w:left w:w="60" w:type="dxa"/>
+              <w:right w:w="60" w:type="dxa"/>
+            </w:tcMar>
+          </w:tcPr>
+          <w:p>
+            <w:pPr>
+              <w:jc w:val="center"/>
+              <w:spacing w:before="0" w:after="0"/>
+            </w:pPr>
+            <w:r>
+              <w:rPr>
+                <w:rFonts w:ascii="Calibri" w:hAnsi="Calibri"/>
+                <w:b/>
+                <w:i w:val="0"/>
+                <w:color w:val="1E3A8A"/>
+                <w:sz w:val="16"/>
+              </w:rPr>
+            </w:r>
+          </w:p>
+        </w:tc>
+        <w:tc>
+          <w:tcPr>
+            <w:tcW w:w="600" w:type="dxa"/>
+            <w:shd w:val="clear" w:color="auto" w:fill="FEF9C3"/>
+            <w:vAlign w:val="center"/>
+            <w:tcMar>
+              <w:top w:w="60" w:type="dxa"/>
+              <w:bottom w:w="60" w:type="dxa"/>
+              <w:left w:w="40" w:type="dxa"/>
+              <w:right w:w="40" w:type="dxa"/>
+            </w:tcMar>
+          </w:tcPr>
+          <w:p>
+            <w:pPr>
+              <w:jc w:val="center"/>
+              <w:spacing w:before="0" w:after="0"/>
+            </w:pPr>
+            <w:r>
+              <w:rPr>
+                <w:rFonts w:ascii="Calibri" w:hAnsi="Calibri"/>
+                <w:b/>
+                <w:i w:val="0"/>
+                <w:color w:val="713F12"/>
+                <w:sz w:val="18"/>
+              </w:rPr>
+              <w:t>C</w:t>
+            </w:r>
+          </w:p>
+        </w:tc>
+        <w:tc>
+          <w:tcPr>
+            <w:tcW w:w="4506" w:type="dxa"/>
+            <w:shd w:val="clear" w:color="auto" w:fill="FEF9C3"/>
+            <w:vAlign w:val="top"/>
+            <w:tcMar>
+              <w:top w:w="60" w:type="dxa"/>
+              <w:bottom w:w="60" w:type="dxa"/>
+              <w:left w:w="100" w:type="dxa"/>
+              <w:right w:w="80" w:type="dxa"/>
+            </w:tcMar>
+          </w:tcPr>
+          <w:p>
+            <w:pPr>
+              <w:jc w:val="left"/>
+              <w:spacing w:before="0" w:after="0"/>
+            </w:pPr>
+            <w:r>
+              <w:rPr>
+                <w:rFonts w:ascii="Calibri" w:hAnsi="Calibri"/>
+                <w:b w:val="0"/>
+                <w:i w:val="0"/>
+                <w:color w:val="713F12"/>
+                <w:sz w:val="18"/>
+              </w:rPr>
+              <w:t>Hukum Gas Ideal</w:t>
+            </w:r>
+          </w:p>
+        </w:tc>
+        <w:tc>
+          <w:tcPr>
+            <w:tcW w:w="800" w:type="dxa"/>
+            <w:shd w:val="clear" w:color="auto" w:fill="BBF7D0"/>
+            <w:vAlign w:val="center"/>
+            <w:tcMar>
+              <w:top w:w="60" w:type="dxa"/>
+              <w:bottom w:w="60" w:type="dxa"/>
+              <w:left w:w="40" w:type="dxa"/>
+              <w:right w:w="40" w:type="dxa"/>
+            </w:tcMar>
+          </w:tcPr>
+          <w:p>
+            <w:pPr>
+              <w:jc w:val="center"/>
+              <w:spacing w:before="0" w:after="0"/>
+            </w:pPr>
+            <w:r>
+              <w:rPr>
+                <w:rFonts w:ascii="Calibri" w:hAnsi="Calibri"/>
+                <w:b/>
+                <w:i w:val="0"/>
+                <w:color w:val="166534"/>
+                <w:sz w:val="18"/>
+              </w:rPr>
+              <w:t>C</w:t>
+            </w:r>
+          </w:p>
+        </w:tc>
+      </w:tr>
+      <w:tr>
+        <w:tc>
+          <w:tcPr>
+            <w:tcW w:w="400" w:type="dxa"/>
+            <w:shd w:val="clear" w:color="auto" w:fill="F1F5F9"/>
+            <w:vAlign w:val="top"/>
+            <w:tcMar>
+              <w:top w:w="80" w:type="dxa"/>
+              <w:bottom w:w="60" w:type="dxa"/>
+              <w:left w:w="60" w:type="dxa"/>
+              <w:right w:w="60" w:type="dxa"/>
+            </w:tcMar>
+          </w:tcPr>
+          <w:p>
+            <w:pPr>
+              <w:jc w:val="center"/>
+              <w:spacing w:before="0" w:after="0"/>
+            </w:pPr>
+          </w:p>
+        </w:tc>
+        <w:tc>
+          <w:tcPr>
+            <w:tcW w:w="3000" w:type="dxa"/>
+            <w:shd w:val="clear" w:color="auto" w:fill="EFF6FF"/>
+            <w:vAlign w:val="top"/>
+            <w:tcMar>
+              <w:top w:w="60" w:type="dxa"/>
+              <w:bottom w:w="60" w:type="dxa"/>
+              <w:left w:w="100" w:type="dxa"/>
+              <w:right w:w="80" w:type="dxa"/>
+            </w:tcMar>
+          </w:tcPr>
+          <w:p>
+            <w:pPr>
+              <w:spacing w:before="0" w:after="0"/>
+            </w:pPr>
+            <w:r>
+              <w:rPr>
+                <w:rFonts w:ascii="Calibri" w:hAnsi="Calibri"/>
+                <w:b w:val="0"/>
+                <w:i w:val="0"/>
+                <w:sz w:val="19"/>
+              </w:rPr>
+            </w:r>
+          </w:p>
+        </w:tc>
+        <w:tc>
+          <w:tcPr>
+            <w:tcW w:w="900" w:type="dxa"/>
+            <w:shd w:val="clear" w:color="auto" w:fill="E0F2FE"/>
+            <w:vAlign w:val="center"/>
+            <w:tcMar>
+              <w:top w:w="60" w:type="dxa"/>
+              <w:bottom w:w="60" w:type="dxa"/>
+              <w:left w:w="60" w:type="dxa"/>
+              <w:right w:w="60" w:type="dxa"/>
+            </w:tcMar>
+          </w:tcPr>
+          <w:p>
+            <w:pPr>
+              <w:jc w:val="center"/>
+              <w:spacing w:before="0" w:after="0"/>
+            </w:pPr>
+            <w:r>
+              <w:rPr>
+                <w:rFonts w:ascii="Calibri" w:hAnsi="Calibri"/>
+                <w:b/>
+                <w:i w:val="0"/>
+                <w:color w:val="1E3A8A"/>
+                <w:sz w:val="16"/>
+              </w:rPr>
+            </w:r>
+          </w:p>
+        </w:tc>
+        <w:tc>
+          <w:tcPr>
+            <w:tcW w:w="600" w:type="dxa"/>
+            <w:shd w:val="clear" w:color="auto" w:fill="F3E8FF"/>
+            <w:vAlign w:val="center"/>
+            <w:tcMar>
+              <w:top w:w="60" w:type="dxa"/>
+              <w:bottom w:w="60" w:type="dxa"/>
+              <w:left w:w="40" w:type="dxa"/>
+              <w:right w:w="40" w:type="dxa"/>
+            </w:tcMar>
+          </w:tcPr>
+          <w:p>
+            <w:pPr>
+              <w:jc w:val="center"/>
+              <w:spacing w:before="0" w:after="0"/>
+            </w:pPr>
+            <w:r>
+              <w:rPr>
+                <w:rFonts w:ascii="Calibri" w:hAnsi="Calibri"/>
+                <w:b/>
+                <w:i w:val="0"/>
+                <w:color w:val="581C87"/>
+                <w:sz w:val="18"/>
+              </w:rPr>
+              <w:t>D</w:t>
+            </w:r>
+          </w:p>
+        </w:tc>
+        <w:tc>
+          <w:tcPr>
+            <w:tcW w:w="4506" w:type="dxa"/>
+            <w:shd w:val="clear" w:color="auto" w:fill="F3E8FF"/>
+            <w:vAlign w:val="top"/>
+            <w:tcMar>
+              <w:top w:w="60" w:type="dxa"/>
+              <w:bottom w:w="60" w:type="dxa"/>
+              <w:left w:w="100" w:type="dxa"/>
+              <w:right w:w="80" w:type="dxa"/>
+            </w:tcMar>
+          </w:tcPr>
+          <w:p>
+            <w:pPr>
+              <w:jc w:val="left"/>
+              <w:spacing w:before="0" w:after="0"/>
+            </w:pPr>
+            <w:r>
+              <w:rPr>
+                <w:rFonts w:ascii="Calibri" w:hAnsi="Calibri"/>
+                <w:b w:val="0"/>
+                <w:i w:val="0"/>
+                <w:color w:val="581C87"/>
+                <w:sz w:val="18"/>
+              </w:rPr>
+              <w:t>Teorema Pythagoras</w:t>
+            </w:r>
+          </w:p>
+        </w:tc>
+        <w:tc>
+          <w:tcPr>
+            <w:tcW w:w="800" w:type="dxa"/>
+            <w:shd w:val="clear" w:color="auto" w:fill="BBF7D0"/>
+            <w:vAlign w:val="center"/>
+            <w:tcMar>
+              <w:top w:w="60" w:type="dxa"/>
+              <w:bottom w:w="60" w:type="dxa"/>
+              <w:left w:w="40" w:type="dxa"/>
+              <w:right w:w="40" w:type="dxa"/>
+            </w:tcMar>
+          </w:tcPr>
+          <w:p>
+            <w:pPr>
+              <w:jc w:val="center"/>
+              <w:spacing w:before="0" w:after="0"/>
+            </w:pPr>
+            <w:r>
+              <w:rPr>
+                <w:rFonts w:ascii="Calibri" w:hAnsi="Calibri"/>
+                <w:b/>
+                <w:i w:val="0"/>
+                <w:color w:val="166534"/>
+                <w:sz w:val="18"/>
+              </w:rPr>
+              <w:t>D</w:t>
+            </w:r>
+          </w:p>
+        </w:tc>
+      </w:tr>
+      <w:tr>
+        <w:tc>
+          <w:tcPr>
+            <w:tcW w:w="400" w:type="dxa"/>
+            <w:shd w:val="clear" w:color="auto" w:fill="F1F5F9"/>
+            <w:vAlign w:val="top"/>
+            <w:tcMar>
+              <w:top w:w="80" w:type="dxa"/>
+              <w:bottom w:w="60" w:type="dxa"/>
+              <w:left w:w="60" w:type="dxa"/>
+              <w:right w:w="60" w:type="dxa"/>
+            </w:tcMar>
+          </w:tcPr>
+          <w:p>
+            <w:pPr>
+              <w:jc w:val="center"/>
+              <w:spacing w:before="0" w:after="0"/>
+            </w:pPr>
+            <w:r>
+              <w:rPr>
+                <w:rFonts w:ascii="Calibri" w:hAnsi="Calibri"/>
+                <w:b/>
+                <w:i w:val="0"/>
+                <w:color w:val="1E3A8A"/>
+                <w:sz w:val="18"/>
+              </w:rPr>
+              <w:t>12</w:t>
+            </w:r>
+          </w:p>
+        </w:tc>
+        <w:tc>
+          <w:tcPr>
+            <w:tcW w:w="3000" w:type="dxa"/>
+            <w:shd w:val="clear" w:color="auto" w:fill="EFF6FF"/>
+            <w:vAlign w:val="top"/>
+            <w:tcMar>
+              <w:top w:w="60" w:type="dxa"/>
+              <w:bottom w:w="60" w:type="dxa"/>
+              <w:left w:w="100" w:type="dxa"/>
+              <w:right w:w="80" w:type="dxa"/>
+            </w:tcMar>
+          </w:tcPr>
+          <w:p>
+            <w:pPr>
+              <w:spacing w:before="0" w:after="0"/>
+            </w:pPr>
+            <w:r>
+              <w:rPr>
+                <w:rFonts w:ascii="Calibri" w:hAnsi="Calibri"/>
+                <w:b w:val="0"/>
+                <w:i w:val="0"/>
+                <w:sz w:val="19"/>
+              </w:rPr>
+              <w:t>Indonesia</w:t>
+            </w:r>
+          </w:p>
+        </w:tc>
+        <w:tc>
+          <w:tcPr>
+            <w:tcW w:w="900" w:type="dxa"/>
+            <w:shd w:val="clear" w:color="auto" w:fill="E0F2FE"/>
+            <w:vAlign w:val="center"/>
+            <w:tcMar>
+              <w:top w:w="60" w:type="dxa"/>
+              <w:bottom w:w="60" w:type="dxa"/>
+              <w:left w:w="60" w:type="dxa"/>
+              <w:right w:w="60" w:type="dxa"/>
+            </w:tcMar>
+          </w:tcPr>
+          <w:p>
+            <w:pPr>
+              <w:jc w:val="center"/>
+              <w:spacing w:before="0" w:after="0"/>
+            </w:pPr>
+            <w:r>
+              <w:rPr>
+                <w:rFonts w:ascii="Calibri" w:hAnsi="Calibri"/>
+                <w:b/>
+                <w:i w:val="0"/>
+                <w:color w:val="1E3A8A"/>
+                <w:sz w:val="16"/>
+              </w:rPr>
+              <w:t>JODOH</w:t>
+            </w:r>
+          </w:p>
+        </w:tc>
+        <w:tc>
+          <w:tcPr>
+            <w:tcW w:w="600" w:type="dxa"/>
+            <w:shd w:val="clear" w:color="auto" w:fill="DBEAFE"/>
+            <w:vAlign w:val="center"/>
+            <w:tcMar>
+              <w:top w:w="60" w:type="dxa"/>
+              <w:bottom w:w="60" w:type="dxa"/>
+              <w:left w:w="40" w:type="dxa"/>
+              <w:right w:w="40" w:type="dxa"/>
+            </w:tcMar>
+          </w:tcPr>
+          <w:p>
+            <w:pPr>
+              <w:jc w:val="center"/>
+              <w:spacing w:before="0" w:after="0"/>
+            </w:pPr>
+            <w:r>
+              <w:rPr>
+                <w:rFonts w:ascii="Calibri" w:hAnsi="Calibri"/>
+                <w:b/>
+                <w:i w:val="0"/>
+                <w:color w:val="1E3A8A"/>
+                <w:sz w:val="18"/>
+              </w:rPr>
+              <w:t>A</w:t>
+            </w:r>
+          </w:p>
+        </w:tc>
+        <w:tc>
+          <w:tcPr>
+            <w:tcW w:w="4506" w:type="dxa"/>
+            <w:shd w:val="clear" w:color="auto" w:fill="DBEAFE"/>
+            <w:vAlign w:val="top"/>
+            <w:tcMar>
+              <w:top w:w="60" w:type="dxa"/>
+              <w:bottom w:w="60" w:type="dxa"/>
+              <w:left w:w="100" w:type="dxa"/>
+              <w:right w:w="80" w:type="dxa"/>
+            </w:tcMar>
+          </w:tcPr>
+          <w:p>
+            <w:pPr>
+              <w:jc w:val="left"/>
+              <w:spacing w:before="0" w:after="0"/>
+            </w:pPr>
+            <w:r>
+              <w:rPr>
+                <w:rFonts w:ascii="Calibri" w:hAnsi="Calibri"/>
+                <w:b w:val="0"/>
+                <w:i w:val="0"/>
+                <w:color w:val="1E3A8A"/>
+                <w:sz w:val="18"/>
+              </w:rPr>
+              <w:t>Jakarta</w:t>
+            </w:r>
+          </w:p>
+        </w:tc>
+        <w:tc>
+          <w:tcPr>
+            <w:tcW w:w="800" w:type="dxa"/>
+            <w:shd w:val="clear" w:color="auto" w:fill="BBF7D0"/>
+            <w:vAlign w:val="center"/>
+            <w:tcMar>
+              <w:top w:w="60" w:type="dxa"/>
+              <w:bottom w:w="60" w:type="dxa"/>
+              <w:left w:w="40" w:type="dxa"/>
+              <w:right w:w="40" w:type="dxa"/>
+            </w:tcMar>
+          </w:tcPr>
+          <w:p>
+            <w:pPr>
+              <w:jc w:val="center"/>
+              <w:spacing w:before="0" w:after="0"/>
+            </w:pPr>
+            <w:r>
+              <w:rPr>
+                <w:rFonts w:ascii="Calibri" w:hAnsi="Calibri"/>
+                <w:b/>
+                <w:i w:val="0"/>
+                <w:color w:val="166534"/>
+                <w:sz w:val="18"/>
+              </w:rPr>
+              <w:t>A</w:t>
+            </w:r>
+          </w:p>
+        </w:tc>
+      </w:tr>
+      <w:tr>
+        <w:tc>
+          <w:tcPr>
+            <w:tcW w:w="400" w:type="dxa"/>
+            <w:shd w:val="clear" w:color="auto" w:fill="F1F5F9"/>
+            <w:vAlign w:val="top"/>
+            <w:tcMar>
+              <w:top w:w="80" w:type="dxa"/>
+              <w:bottom w:w="60" w:type="dxa"/>
+              <w:left w:w="60" w:type="dxa"/>
+              <w:right w:w="60" w:type="dxa"/>
+            </w:tcMar>
+          </w:tcPr>
+          <w:p>
+            <w:pPr>
+              <w:jc w:val="center"/>
+              <w:spacing w:before="0" w:after="0"/>
+            </w:pPr>
+          </w:p>
+        </w:tc>
+        <w:tc>
+          <w:tcPr>
+            <w:tcW w:w="3000" w:type="dxa"/>
+            <w:shd w:val="clear" w:color="auto" w:fill="EFF6FF"/>
+            <w:vAlign w:val="top"/>
+            <w:tcMar>
+              <w:top w:w="60" w:type="dxa"/>
+              <w:bottom w:w="60" w:type="dxa"/>
+              <w:left w:w="100" w:type="dxa"/>
+              <w:right w:w="80" w:type="dxa"/>
+            </w:tcMar>
+          </w:tcPr>
+          <w:p>
+            <w:pPr>
+              <w:spacing w:before="0" w:after="0"/>
+            </w:pPr>
+            <w:r>
+              <w:rPr>
+                <w:rFonts w:ascii="Calibri" w:hAnsi="Calibri"/>
+                <w:b w:val="0"/>
+                <w:i w:val="0"/>
+                <w:sz w:val="19"/>
+              </w:rPr>
+            </w:r>
+          </w:p>
+        </w:tc>
+        <w:tc>
+          <w:tcPr>
+            <w:tcW w:w="900" w:type="dxa"/>
+            <w:shd w:val="clear" w:color="auto" w:fill="E0F2FE"/>
+            <w:vAlign w:val="center"/>
+            <w:tcMar>
+              <w:top w:w="60" w:type="dxa"/>
+              <w:bottom w:w="60" w:type="dxa"/>
+              <w:left w:w="60" w:type="dxa"/>
+              <w:right w:w="60" w:type="dxa"/>
+            </w:tcMar>
+          </w:tcPr>
+          <w:p>
+            <w:pPr>
+              <w:jc w:val="center"/>
+              <w:spacing w:before="0" w:after="0"/>
+            </w:pPr>
+            <w:r>
+              <w:rPr>
+                <w:rFonts w:ascii="Calibri" w:hAnsi="Calibri"/>
+                <w:b/>
+                <w:i w:val="0"/>
+                <w:color w:val="1E3A8A"/>
+                <w:sz w:val="16"/>
+              </w:rPr>
+            </w:r>
+          </w:p>
+        </w:tc>
+        <w:tc>
+          <w:tcPr>
+            <w:tcW w:w="600" w:type="dxa"/>
+            <w:shd w:val="clear" w:color="auto" w:fill="DCFCE7"/>
+            <w:vAlign w:val="center"/>
+            <w:tcMar>
+              <w:top w:w="60" w:type="dxa"/>
+              <w:bottom w:w="60" w:type="dxa"/>
+              <w:left w:w="40" w:type="dxa"/>
+              <w:right w:w="40" w:type="dxa"/>
+            </w:tcMar>
+          </w:tcPr>
+          <w:p>
+            <w:pPr>
+              <w:jc w:val="center"/>
+              <w:spacing w:before="0" w:after="0"/>
+            </w:pPr>
+            <w:r>
+              <w:rPr>
+                <w:rFonts w:ascii="Calibri" w:hAnsi="Calibri"/>
+                <w:b/>
+                <w:i w:val="0"/>
+                <w:color w:val="14532D"/>
+                <w:sz w:val="18"/>
+              </w:rPr>
+              <w:t>B</w:t>
+            </w:r>
+          </w:p>
+        </w:tc>
+        <w:tc>
+          <w:tcPr>
+            <w:tcW w:w="4506" w:type="dxa"/>
+            <w:shd w:val="clear" w:color="auto" w:fill="DCFCE7"/>
+            <w:vAlign w:val="top"/>
+            <w:tcMar>
+              <w:top w:w="60" w:type="dxa"/>
+              <w:bottom w:w="60" w:type="dxa"/>
+              <w:left w:w="100" w:type="dxa"/>
+              <w:right w:w="80" w:type="dxa"/>
+            </w:tcMar>
+          </w:tcPr>
+          <w:p>
+            <w:pPr>
+              <w:jc w:val="left"/>
+              <w:spacing w:before="0" w:after="0"/>
+            </w:pPr>
+            <w:r>
+              <w:rPr>
+                <w:rFonts w:ascii="Calibri" w:hAnsi="Calibri"/>
+                <w:b w:val="0"/>
+                <w:i w:val="0"/>
+                <w:color w:val="14532D"/>
+                <w:sz w:val="18"/>
+              </w:rPr>
+              <w:t>Tokyo</w:t>
+            </w:r>
+          </w:p>
+        </w:tc>
+        <w:tc>
+          <w:tcPr>
+            <w:tcW w:w="800" w:type="dxa"/>
+            <w:shd w:val="clear" w:color="auto" w:fill="BBF7D0"/>
+            <w:vAlign w:val="center"/>
+            <w:tcMar>
+              <w:top w:w="60" w:type="dxa"/>
+              <w:bottom w:w="60" w:type="dxa"/>
+              <w:left w:w="40" w:type="dxa"/>
+              <w:right w:w="40" w:type="dxa"/>
+            </w:tcMar>
+          </w:tcPr>
+          <w:p>
+            <w:pPr>
+              <w:jc w:val="center"/>
+              <w:spacing w:before="0" w:after="0"/>
+            </w:pPr>
+            <w:r>
+              <w:rPr>
+                <w:rFonts w:ascii="Calibri" w:hAnsi="Calibri"/>
+                <w:b/>
+                <w:i w:val="0"/>
+                <w:color w:val="166534"/>
+                <w:sz w:val="18"/>
+              </w:rPr>
+              <w:t>B</w:t>
+            </w:r>
+          </w:p>
+        </w:tc>
+      </w:tr>
+      <w:tr>
+        <w:tc>
+          <w:tcPr>
+            <w:tcW w:w="400" w:type="dxa"/>
+            <w:shd w:val="clear" w:color="auto" w:fill="F1F5F9"/>
+            <w:vAlign w:val="top"/>
+            <w:tcMar>
+              <w:top w:w="80" w:type="dxa"/>
+              <w:bottom w:w="60" w:type="dxa"/>
+              <w:left w:w="60" w:type="dxa"/>
+              <w:right w:w="60" w:type="dxa"/>
+            </w:tcMar>
+          </w:tcPr>
+          <w:p>
+            <w:pPr>
+              <w:jc w:val="center"/>
+              <w:spacing w:before="0" w:after="0"/>
+            </w:pPr>
+          </w:p>
+        </w:tc>
+        <w:tc>
+          <w:tcPr>
+            <w:tcW w:w="3000" w:type="dxa"/>
+            <w:shd w:val="clear" w:color="auto" w:fill="EFF6FF"/>
+            <w:vAlign w:val="top"/>
+            <w:tcMar>
+              <w:top w:w="60" w:type="dxa"/>
+              <w:bottom w:w="60" w:type="dxa"/>
+              <w:left w:w="100" w:type="dxa"/>
+              <w:right w:w="80" w:type="dxa"/>
+            </w:tcMar>
+          </w:tcPr>
+          <w:p>
+            <w:pPr>
+              <w:spacing w:before="0" w:after="0"/>
+            </w:pPr>
+            <w:r>
+              <w:rPr>
+                <w:rFonts w:ascii="Calibri" w:hAnsi="Calibri"/>
+                <w:b w:val="0"/>
+                <w:i w:val="0"/>
+                <w:sz w:val="19"/>
+              </w:rPr>
+            </w:r>
+          </w:p>
+        </w:tc>
+        <w:tc>
+          <w:tcPr>
+            <w:tcW w:w="900" w:type="dxa"/>
+            <w:shd w:val="clear" w:color="auto" w:fill="E0F2FE"/>
+            <w:vAlign w:val="center"/>
+            <w:tcMar>
+              <w:top w:w="60" w:type="dxa"/>
+              <w:bottom w:w="60" w:type="dxa"/>
+              <w:left w:w="60" w:type="dxa"/>
+              <w:right w:w="60" w:type="dxa"/>
+            </w:tcMar>
+          </w:tcPr>
+          <w:p>
+            <w:pPr>
+              <w:jc w:val="center"/>
+              <w:spacing w:before="0" w:after="0"/>
+            </w:pPr>
+            <w:r>
+              <w:rPr>
+                <w:rFonts w:ascii="Calibri" w:hAnsi="Calibri"/>
+                <w:b/>
+                <w:i w:val="0"/>
+                <w:color w:val="1E3A8A"/>
+                <w:sz w:val="16"/>
+              </w:rPr>
+            </w:r>
+          </w:p>
+        </w:tc>
+        <w:tc>
+          <w:tcPr>
+            <w:tcW w:w="600" w:type="dxa"/>
+            <w:shd w:val="clear" w:color="auto" w:fill="FEF9C3"/>
+            <w:vAlign w:val="center"/>
+            <w:tcMar>
+              <w:top w:w="60" w:type="dxa"/>
+              <w:bottom w:w="60" w:type="dxa"/>
+              <w:left w:w="40" w:type="dxa"/>
+              <w:right w:w="40" w:type="dxa"/>
+            </w:tcMar>
+          </w:tcPr>
+          <w:p>
+            <w:pPr>
+              <w:jc w:val="center"/>
+              <w:spacing w:before="0" w:after="0"/>
+            </w:pPr>
+            <w:r>
+              <w:rPr>
+                <w:rFonts w:ascii="Calibri" w:hAnsi="Calibri"/>
+                <w:b/>
+                <w:i w:val="0"/>
+                <w:color w:val="713F12"/>
+                <w:sz w:val="18"/>
+              </w:rPr>
+              <w:t>C</w:t>
+            </w:r>
+          </w:p>
+        </w:tc>
+        <w:tc>
+          <w:tcPr>
+            <w:tcW w:w="4506" w:type="dxa"/>
+            <w:shd w:val="clear" w:color="auto" w:fill="FEF9C3"/>
+            <w:vAlign w:val="top"/>
+            <w:tcMar>
+              <w:top w:w="60" w:type="dxa"/>
+              <w:bottom w:w="60" w:type="dxa"/>
+              <w:left w:w="100" w:type="dxa"/>
+              <w:right w:w="80" w:type="dxa"/>
+            </w:tcMar>
+          </w:tcPr>
+          <w:p>
+            <w:pPr>
+              <w:jc w:val="left"/>
+              <w:spacing w:before="0" w:after="0"/>
+            </w:pPr>
+            <w:r>
+              <w:rPr>
+                <w:rFonts w:ascii="Calibri" w:hAnsi="Calibri"/>
+                <w:b w:val="0"/>
+                <w:i w:val="0"/>
+                <w:color w:val="713F12"/>
+                <w:sz w:val="18"/>
+              </w:rPr>
+              <w:t>Washington D.C.</w:t>
+            </w:r>
+          </w:p>
+        </w:tc>
+        <w:tc>
+          <w:tcPr>
+            <w:tcW w:w="800" w:type="dxa"/>
+            <w:shd w:val="clear" w:color="auto" w:fill="BBF7D0"/>
+            <w:vAlign w:val="center"/>
+            <w:tcMar>
+              <w:top w:w="60" w:type="dxa"/>
+              <w:bottom w:w="60" w:type="dxa"/>
+              <w:left w:w="40" w:type="dxa"/>
+              <w:right w:w="40" w:type="dxa"/>
+            </w:tcMar>
+          </w:tcPr>
+          <w:p>
+            <w:pPr>
+              <w:jc w:val="center"/>
+              <w:spacing w:before="0" w:after="0"/>
+            </w:pPr>
+            <w:r>
+              <w:rPr>
+                <w:rFonts w:ascii="Calibri" w:hAnsi="Calibri"/>
+                <w:b/>
+                <w:i w:val="0"/>
+                <w:color w:val="166534"/>
+                <w:sz w:val="18"/>
+              </w:rPr>
+              <w:t>C</w:t>
+            </w:r>
+          </w:p>
+        </w:tc>
+      </w:tr>
+      <w:tr>
+        <w:tc>
+          <w:tcPr>
+            <w:tcW w:w="400" w:type="dxa"/>
+            <w:shd w:val="clear" w:color="auto" w:fill="F1F5F9"/>
+            <w:vAlign w:val="top"/>
+            <w:tcMar>
+              <w:top w:w="80" w:type="dxa"/>
+              <w:bottom w:w="60" w:type="dxa"/>
+              <w:left w:w="60" w:type="dxa"/>
+              <w:right w:w="60" w:type="dxa"/>
+            </w:tcMar>
+          </w:tcPr>
+          <w:p>
+            <w:pPr>
+              <w:jc w:val="center"/>
+              <w:spacing w:before="0" w:after="0"/>
+            </w:pPr>
+          </w:p>
+        </w:tc>
+        <w:tc>
+          <w:tcPr>
+            <w:tcW w:w="3000" w:type="dxa"/>
+            <w:shd w:val="clear" w:color="auto" w:fill="EFF6FF"/>
+            <w:vAlign w:val="top"/>
+            <w:tcMar>
+              <w:top w:w="60" w:type="dxa"/>
+              <w:bottom w:w="60" w:type="dxa"/>
+              <w:left w:w="100" w:type="dxa"/>
+              <w:right w:w="80" w:type="dxa"/>
+            </w:tcMar>
+          </w:tcPr>
+          <w:p>
+            <w:pPr>
+              <w:spacing w:before="0" w:after="0"/>
+            </w:pPr>
+            <w:r>
+              <w:rPr>
+                <w:rFonts w:ascii="Calibri" w:hAnsi="Calibri"/>
+                <w:b w:val="0"/>
+                <w:i w:val="0"/>
+                <w:sz w:val="19"/>
+              </w:rPr>
+            </w:r>
+          </w:p>
+        </w:tc>
+        <w:tc>
+          <w:tcPr>
+            <w:tcW w:w="900" w:type="dxa"/>
+            <w:shd w:val="clear" w:color="auto" w:fill="E0F2FE"/>
+            <w:vAlign w:val="center"/>
+            <w:tcMar>
+              <w:top w:w="60" w:type="dxa"/>
+              <w:bottom w:w="60" w:type="dxa"/>
+              <w:left w:w="60" w:type="dxa"/>
+              <w:right w:w="60" w:type="dxa"/>
+            </w:tcMar>
+          </w:tcPr>
+          <w:p>
+            <w:pPr>
+              <w:jc w:val="center"/>
+              <w:spacing w:before="0" w:after="0"/>
+            </w:pPr>
+            <w:r>
+              <w:rPr>
+                <w:rFonts w:ascii="Calibri" w:hAnsi="Calibri"/>
+                <w:b/>
+                <w:i w:val="0"/>
+                <w:color w:val="1E3A8A"/>
+                <w:sz w:val="16"/>
+              </w:rPr>
+            </w:r>
+          </w:p>
+        </w:tc>
+        <w:tc>
+          <w:tcPr>
+            <w:tcW w:w="600" w:type="dxa"/>
+            <w:shd w:val="clear" w:color="auto" w:fill="F3E8FF"/>
+            <w:vAlign w:val="center"/>
+            <w:tcMar>
+              <w:top w:w="60" w:type="dxa"/>
+              <w:bottom w:w="60" w:type="dxa"/>
+              <w:left w:w="40" w:type="dxa"/>
+              <w:right w:w="40" w:type="dxa"/>
+            </w:tcMar>
+          </w:tcPr>
+          <w:p>
+            <w:pPr>
+              <w:jc w:val="center"/>
+              <w:spacing w:before="0" w:after="0"/>
+            </w:pPr>
+            <w:r>
+              <w:rPr>
+                <w:rFonts w:ascii="Calibri" w:hAnsi="Calibri"/>
+                <w:b/>
+                <w:i w:val="0"/>
+                <w:color w:val="581C87"/>
+                <w:sz w:val="18"/>
+              </w:rPr>
+              <w:t>D</w:t>
+            </w:r>
+          </w:p>
+        </w:tc>
+        <w:tc>
+          <w:tcPr>
+            <w:tcW w:w="4506" w:type="dxa"/>
+            <w:shd w:val="clear" w:color="auto" w:fill="F3E8FF"/>
+            <w:vAlign w:val="top"/>
+            <w:tcMar>
+              <w:top w:w="60" w:type="dxa"/>
+              <w:bottom w:w="60" w:type="dxa"/>
+              <w:left w:w="100" w:type="dxa"/>
+              <w:right w:w="80" w:type="dxa"/>
+            </w:tcMar>
+          </w:tcPr>
+          <w:p>
+            <w:pPr>
+              <w:jc w:val="left"/>
+              <w:spacing w:before="0" w:after="0"/>
+            </w:pPr>
+            <w:r>
+              <w:rPr>
+                <w:rFonts w:ascii="Calibri" w:hAnsi="Calibri"/>
+                <w:b w:val="0"/>
+                <w:i w:val="0"/>
+                <w:color w:val="581C87"/>
+                <w:sz w:val="18"/>
+              </w:rPr>
+              <w:t>Canberra</w:t>
+            </w:r>
+          </w:p>
+        </w:tc>
+        <w:tc>
+          <w:tcPr>
+            <w:tcW w:w="800" w:type="dxa"/>
+            <w:shd w:val="clear" w:color="auto" w:fill="BBF7D0"/>
+            <w:vAlign w:val="center"/>
+            <w:tcMar>
+              <w:top w:w="60" w:type="dxa"/>
+              <w:bottom w:w="60" w:type="dxa"/>
+              <w:left w:w="40" w:type="dxa"/>
+              <w:right w:w="40" w:type="dxa"/>
+            </w:tcMar>
+          </w:tcPr>
+          <w:p>
+            <w:pPr>
+              <w:jc w:val="center"/>
+              <w:spacing w:before="0" w:after="0"/>
+            </w:pPr>
+            <w:r>
+              <w:rPr>
+                <w:rFonts w:ascii="Calibri" w:hAnsi="Calibri"/>
+                <w:b/>
+                <w:i w:val="0"/>
+                <w:color w:val="166534"/>
+                <w:sz w:val="18"/>
+              </w:rPr>
+              <w:t>D</w:t>
+            </w:r>
+          </w:p>
+        </w:tc>
+      </w:tr>
+      <w:tr>
+        <w:tc>
+          <w:tcPr>
+            <w:tcW w:w="400" w:type="dxa"/>
+            <w:shd w:val="clear" w:color="auto" w:fill="F1F5F9"/>
+            <w:vAlign w:val="top"/>
+            <w:tcMar>
+              <w:top w:w="80" w:type="dxa"/>
+              <w:bottom w:w="60" w:type="dxa"/>
+              <w:left w:w="60" w:type="dxa"/>
+              <w:right w:w="60" w:type="dxa"/>
+            </w:tcMar>
+          </w:tcPr>
+          <w:p>
+            <w:pPr>
+              <w:jc w:val="center"/>
+              <w:spacing w:before="0" w:after="0"/>
+            </w:pPr>
+          </w:p>
+        </w:tc>
+        <w:tc>
+          <w:tcPr>
+            <w:tcW w:w="3000" w:type="dxa"/>
+            <w:shd w:val="clear" w:color="auto" w:fill="EFF6FF"/>
+            <w:vAlign w:val="top"/>
+            <w:tcMar>
+              <w:top w:w="60" w:type="dxa"/>
+              <w:bottom w:w="60" w:type="dxa"/>
+              <w:left w:w="100" w:type="dxa"/>
+              <w:right w:w="80" w:type="dxa"/>
+            </w:tcMar>
+          </w:tcPr>
+          <w:p>
+            <w:pPr>
+              <w:spacing w:before="0" w:after="0"/>
+            </w:pPr>
+            <w:r>
+              <w:rPr>
+                <w:rFonts w:ascii="Calibri" w:hAnsi="Calibri"/>
+                <w:b w:val="0"/>
+                <w:i w:val="0"/>
+                <w:sz w:val="19"/>
+              </w:rPr>
+            </w:r>
+          </w:p>
+        </w:tc>
+        <w:tc>
+          <w:tcPr>
+            <w:tcW w:w="900" w:type="dxa"/>
+            <w:shd w:val="clear" w:color="auto" w:fill="E0F2FE"/>
+            <w:vAlign w:val="center"/>
+            <w:tcMar>
+              <w:top w:w="60" w:type="dxa"/>
+              <w:bottom w:w="60" w:type="dxa"/>
+              <w:left w:w="60" w:type="dxa"/>
+              <w:right w:w="60" w:type="dxa"/>
+            </w:tcMar>
+          </w:tcPr>
+          <w:p>
+            <w:pPr>
+              <w:jc w:val="center"/>
+              <w:spacing w:before="0" w:after="0"/>
+            </w:pPr>
+            <w:r>
+              <w:rPr>
+                <w:rFonts w:ascii="Calibri" w:hAnsi="Calibri"/>
+                <w:b/>
+                <w:i w:val="0"/>
+                <w:color w:val="1E3A8A"/>
+                <w:sz w:val="16"/>
+              </w:rPr>
+            </w:r>
+          </w:p>
+        </w:tc>
+        <w:tc>
+          <w:tcPr>
+            <w:tcW w:w="600" w:type="dxa"/>
+            <w:shd w:val="clear" w:color="auto" w:fill="FFE4E6"/>
+            <w:vAlign w:val="center"/>
+            <w:tcMar>
+              <w:top w:w="60" w:type="dxa"/>
+              <w:bottom w:w="60" w:type="dxa"/>
+              <w:left w:w="40" w:type="dxa"/>
+              <w:right w:w="40" w:type="dxa"/>
+            </w:tcMar>
+          </w:tcPr>
+          <w:p>
+            <w:pPr>
+              <w:jc w:val="center"/>
+              <w:spacing w:before="0" w:after="0"/>
+            </w:pPr>
+            <w:r>
+              <w:rPr>
+                <w:rFonts w:ascii="Calibri" w:hAnsi="Calibri"/>
+                <w:b/>
+                <w:i w:val="0"/>
+                <w:color w:val="881337"/>
+                <w:sz w:val="18"/>
+              </w:rPr>
+              <w:t>E</w:t>
+            </w:r>
+          </w:p>
+        </w:tc>
+        <w:tc>
+          <w:tcPr>
+            <w:tcW w:w="4506" w:type="dxa"/>
+            <w:shd w:val="clear" w:color="auto" w:fill="FFE4E6"/>
+            <w:vAlign w:val="top"/>
+            <w:tcMar>
+              <w:top w:w="60" w:type="dxa"/>
+              <w:bottom w:w="60" w:type="dxa"/>
+              <w:left w:w="100" w:type="dxa"/>
+              <w:right w:w="80" w:type="dxa"/>
+            </w:tcMar>
+          </w:tcPr>
+          <w:p>
+            <w:pPr>
+              <w:jc w:val="left"/>
+              <w:spacing w:before="0" w:after="0"/>
+            </w:pPr>
+            <w:r>
+              <w:rPr>
+                <w:rFonts w:ascii="Calibri" w:hAnsi="Calibri"/>
+                <w:b w:val="0"/>
+                <w:i w:val="0"/>
+                <w:color w:val="881337"/>
+                <w:sz w:val="18"/>
+              </w:rPr>
+              <w:t>Brasilia</w:t>
+            </w:r>
+          </w:p>
+        </w:tc>
+        <w:tc>
+          <w:tcPr>
+            <w:tcW w:w="800" w:type="dxa"/>
+            <w:shd w:val="clear" w:color="auto" w:fill="BBF7D0"/>
+            <w:vAlign w:val="center"/>
+            <w:tcMar>
+              <w:top w:w="60" w:type="dxa"/>
+              <w:bottom w:w="60" w:type="dxa"/>
+              <w:left w:w="40" w:type="dxa"/>
+              <w:right w:w="40" w:type="dxa"/>
+            </w:tcMar>
+          </w:tcPr>
+          <w:p>
+            <w:pPr>
+              <w:jc w:val="center"/>
+              <w:spacing w:before="0" w:after="0"/>
+            </w:pPr>
+            <w:r>
+              <w:rPr>
+                <w:rFonts w:ascii="Calibri" w:hAnsi="Calibri"/>
+                <w:b/>
+                <w:i w:val="0"/>
+                <w:color w:val="166534"/>
+                <w:sz w:val="18"/>
+              </w:rPr>
+              <w:t>E</w:t>
+            </w:r>
+          </w:p>
+        </w:tc>
+      </w:tr>
+      <w:tr>
+        <w:tc>
+          <w:tcPr>
             <w:tcW w:w="10206" w:type="dxa"/>
             <w:gridSpan w:val="6"/>
             <w:shd w:val="clear" w:color="auto" w:fill="1E3A8A"/>
@@ -4291,7 +8416,7 @@
                 <w:color w:val="1E3A8A"/>
                 <w:sz w:val="18"/>
               </w:rPr>
-              <w:t>8</w:t>
+              <w:t>13</w:t>
             </w:r>
           </w:p>
         </w:tc>
@@ -4318,7 +8443,7 @@
                 <w:i w:val="0"/>
                 <w:sz w:val="19"/>
               </w:rPr>
-              <w:t>Jelaskan pengertian Pancasila dan sebutkan 5 silanya!</w:t>
+              <w:t>Jelaskan pengertian Pancasila dan sebutkan 5 silanya beserta lambangnya!</w:t>
             </w:r>
           </w:p>
         </w:tc>
@@ -4404,19 +8529,19 @@
                 <w:color w:val="92400E"/>
                 <w:sz w:val="18"/>
               </w:rPr>
-              <w:t>Pancasila adalah dasar negara Indonesia yang terdiri dari 5 sila:</w:t>
+              <w:t>Pancasila adalah dasar negara Indonesia. 5 sila:</w:t>
               <w:br/>
-              <w:t>1. Ketuhanan YME</w:t>
+              <w:t>1. Ketuhanan YME (bintang)</w:t>
               <w:br/>
-              <w:t>2. Kemanusiaan</w:t>
+              <w:t>2. Kemanusiaan yang adil (rantai)</w:t>
               <w:br/>
-              <w:t>3. Persatuan</w:t>
+              <w:t>3. Persatuan Indonesia (pohon beringin)</w:t>
               <w:br/>
-              <w:t>4. Kerakyatan</w:t>
+              <w:t>4. Kerakyatan (kepala banteng)</w:t>
               <w:br/>
-              <w:t>5. Keadilan Sosial.</w:t>
+              <w:t>5. Keadilan Sosial (padi &amp; kapas).</w:t>
               <w:br/>
-              <w:t>(Skor: 2 poin per sila + 2 poin definisi)</w:t>
+              <w:t>Rubrik: definisi (2), masing-masing sila+lambang (8).</w:t>
             </w:r>
           </w:p>
         </w:tc>
@@ -4476,7 +8601,7 @@
                 <w:color w:val="1E3A8A"/>
                 <w:sz w:val="18"/>
               </w:rPr>
-              <w:t>9</w:t>
+              <w:t>14</w:t>
             </w:r>
           </w:p>
         </w:tc>
@@ -4503,7 +8628,9 @@
                 <w:i w:val="0"/>
                 <w:sz w:val="19"/>
               </w:rPr>
-              <w:t>Hitunglah luas persegi panjang dengan panjang 12 cm dan lebar 8 cm, serta jelaskan caranya!</w:t>
+              <w:t>Tonton video eksperimen berikut, kemudian analisislah permasalahan yang terjadi!</w:t>
+              <w:br/>
+              <w:t>MEDIA: https://example.com/video/eksperimen-kimia.mp4</w:t>
             </w:r>
           </w:p>
         </w:tc>
@@ -4589,9 +8716,190 @@
                 <w:color w:val="92400E"/>
                 <w:sz w:val="18"/>
               </w:rPr>
+              <w:t>Rubrik penilaian:</w:t>
+              <w:br/>
+              <w:t>- Identifikasi masalah (3 poin)</w:t>
+              <w:br/>
+              <w:t>- Analisis penyebab (3 poin)</w:t>
+              <w:br/>
+              <w:t>- Solusi yang tepat (4 poin)</w:t>
+              <w:br/>
+              <w:t>Total: 10 poin</w:t>
+            </w:r>
+          </w:p>
+        </w:tc>
+        <w:tc>
+          <w:tcPr>
+            <w:tcW w:w="800" w:type="dxa"/>
+            <w:shd w:val="clear" w:color="auto" w:fill="FEF9C3"/>
+            <w:vAlign w:val="center"/>
+            <w:tcMar>
+              <w:top w:w="60" w:type="dxa"/>
+              <w:bottom w:w="60" w:type="dxa"/>
+              <w:left w:w="40" w:type="dxa"/>
+              <w:right w:w="40" w:type="dxa"/>
+            </w:tcMar>
+          </w:tcPr>
+          <w:p>
+            <w:pPr>
+              <w:jc w:val="center"/>
+              <w:spacing w:before="0" w:after="0"/>
+            </w:pPr>
+            <w:r>
+              <w:rPr>
+                <w:rFonts w:ascii="Calibri" w:hAnsi="Calibri"/>
+                <w:b/>
+                <w:i w:val="0"/>
+                <w:color w:val="92400E"/>
+                <w:sz w:val="16"/>
+              </w:rPr>
+              <w:t>Rubrik</w:t>
+            </w:r>
+          </w:p>
+        </w:tc>
+      </w:tr>
+      <w:tr>
+        <w:tc>
+          <w:tcPr>
+            <w:tcW w:w="400" w:type="dxa"/>
+            <w:shd w:val="clear" w:color="auto" w:fill="F1F5F9"/>
+            <w:vAlign w:val="top"/>
+            <w:tcMar>
+              <w:top w:w="80" w:type="dxa"/>
+              <w:bottom w:w="60" w:type="dxa"/>
+              <w:left w:w="60" w:type="dxa"/>
+              <w:right w:w="60" w:type="dxa"/>
+            </w:tcMar>
+          </w:tcPr>
+          <w:p>
+            <w:pPr>
+              <w:jc w:val="center"/>
+              <w:spacing w:before="0" w:after="0"/>
+            </w:pPr>
+            <w:r>
+              <w:rPr>
+                <w:rFonts w:ascii="Calibri" w:hAnsi="Calibri"/>
+                <w:b/>
+                <w:i w:val="0"/>
+                <w:color w:val="1E3A8A"/>
+                <w:sz w:val="18"/>
+              </w:rPr>
+              <w:t>15</w:t>
+            </w:r>
+          </w:p>
+        </w:tc>
+        <w:tc>
+          <w:tcPr>
+            <w:tcW w:w="3000" w:type="dxa"/>
+            <w:shd w:val="clear" w:color="auto" w:fill="EFF6FF"/>
+            <w:vAlign w:val="top"/>
+            <w:tcMar>
+              <w:top w:w="80" w:type="dxa"/>
+              <w:bottom w:w="60" w:type="dxa"/>
+              <w:left w:w="100" w:type="dxa"/>
+              <w:right w:w="80" w:type="dxa"/>
+            </w:tcMar>
+          </w:tcPr>
+          <w:p>
+            <w:pPr>
+              <w:spacing w:before="0" w:after="0"/>
+            </w:pPr>
+            <w:r>
+              <w:rPr>
+                <w:rFonts w:ascii="Calibri" w:hAnsi="Calibri"/>
+                <w:b w:val="0"/>
+                <w:i w:val="0"/>
+                <w:sz w:val="19"/>
+              </w:rPr>
+              <w:t>Hitunglah luas persegi panjang dengan panjang 12 cm dan lebar 8 cm, serta jelaskan caranya step by step!</w:t>
+            </w:r>
+          </w:p>
+        </w:tc>
+        <w:tc>
+          <w:tcPr>
+            <w:tcW w:w="900" w:type="dxa"/>
+            <w:shd w:val="clear" w:color="auto" w:fill="FEF3C7"/>
+            <w:vAlign w:val="center"/>
+            <w:tcMar>
+              <w:top w:w="80" w:type="dxa"/>
+              <w:bottom w:w="80" w:type="dxa"/>
+              <w:left w:w="60" w:type="dxa"/>
+              <w:right w:w="60" w:type="dxa"/>
+            </w:tcMar>
+          </w:tcPr>
+          <w:p>
+            <w:pPr>
+              <w:jc w:val="center"/>
+              <w:spacing w:before="0" w:after="0"/>
+            </w:pPr>
+            <w:r>
+              <w:rPr>
+                <w:rFonts w:ascii="Calibri" w:hAnsi="Calibri"/>
+                <w:b/>
+                <w:i w:val="0"/>
+                <w:color w:val="1E3A8A"/>
+                <w:sz w:val="16"/>
+              </w:rPr>
+              <w:t>ESAI</w:t>
+            </w:r>
+          </w:p>
+        </w:tc>
+        <w:tc>
+          <w:tcPr>
+            <w:tcW w:w="600" w:type="dxa"/>
+            <w:shd w:val="clear" w:color="auto" w:fill="F8FAFC"/>
+            <w:vAlign w:val="center"/>
+            <w:tcMar>
+              <w:top w:w="60" w:type="dxa"/>
+              <w:bottom w:w="60" w:type="dxa"/>
+              <w:left w:w="100" w:type="dxa"/>
+              <w:right w:w="80" w:type="dxa"/>
+            </w:tcMar>
+          </w:tcPr>
+          <w:p>
+            <w:pPr>
+              <w:jc w:val="center"/>
+              <w:spacing w:before="0" w:after="0"/>
+            </w:pPr>
+            <w:r>
+              <w:rPr>
+                <w:rFonts w:ascii="Calibri" w:hAnsi="Calibri"/>
+                <w:b w:val="0"/>
+                <w:i w:val="0"/>
+                <w:color w:val="94A3B8"/>
+                <w:sz w:val="18"/>
+              </w:rPr>
+              <w:t>—</w:t>
+            </w:r>
+          </w:p>
+        </w:tc>
+        <w:tc>
+          <w:tcPr>
+            <w:tcW w:w="4506" w:type="dxa"/>
+            <w:shd w:val="clear" w:color="auto" w:fill="FFFDE7"/>
+            <w:vAlign w:val="top"/>
+            <w:tcMar>
+              <w:top w:w="80" w:type="dxa"/>
+              <w:bottom w:w="60" w:type="dxa"/>
+              <w:left w:w="100" w:type="dxa"/>
+              <w:right w:w="80" w:type="dxa"/>
+            </w:tcMar>
+          </w:tcPr>
+          <w:p>
+            <w:pPr>
+              <w:spacing w:before="0" w:after="0"/>
+            </w:pPr>
+            <w:r>
+              <w:rPr>
+                <w:rFonts w:ascii="Calibri" w:hAnsi="Calibri"/>
+                <w:b w:val="0"/>
+                <w:i/>
+                <w:color w:val="92400E"/>
+                <w:sz w:val="18"/>
+              </w:rPr>
               <w:t>L = p × l = 12 × 8 = 96 cm².</w:t>
               <w:br/>
-              <w:t>Rubrik: rumus benar (4), perhitungan benar (4), satuan benar (2).</w:t>
+              <w:t>Rubrik: penulisan rumus benar (3), substitusi nilai (3), hasil &amp; satuan benar (4).</w:t>
             </w:r>
           </w:p>
         </w:tc>
@@ -4639,7 +8947,7 @@
           <w:color w:val="64748B"/>
           <w:sz w:val="16"/>
         </w:rPr>
-        <w:t>CATATAN:  Kolom JENIS otomatis terdeteksi saat import. Nilai di kolom KUNCI: V = benar (PG), huruf pasangan (Menjodohkan), angka skor (Esai). Hapus baris CONTOH di atas dan ganti dengan soal Anda sendiri.</w:t>
+        <w:t>CATATAN:  Template ini berisi 15 contoh soal (3 per jenis). Hapus semua baris contoh dan ganti dengan soal Anda. Untuk soal bergambar: sisipkan gambar langsung di sel SOAL. Untuk soal audio/video: tulis URL media di teks soal dengan format  MEDIA: https://... Nilai KUNCI: V = benar (PG/B-S), teks pasangan (Menjodohkan), angka skor (Esai).</w:t>
       </w:r>
     </w:p>
     <w:sectPr>

</xml_diff>